<commit_message>
Ajout et Amelioration de la conclusion
</commit_message>
<xml_diff>
--- a/Projet Reseau II.docx
+++ b/Projet Reseau II.docx
@@ -1,6 +1,6 @@
 
 <file path=word/document.xml><?xml version="1.0" encoding="utf-8"?>
-<w:document xmlns:wpc="http://schemas.microsoft.com/office/word/2010/wordprocessingCanvas" xmlns:cx="http://schemas.microsoft.com/office/drawing/2014/chartex" xmlns:cx1="http://schemas.microsoft.com/office/drawing/2015/9/8/chartex" xmlns:cx2="http://schemas.microsoft.com/office/drawing/2015/10/21/chartex" xmlns:cx3="http://schemas.microsoft.com/office/drawing/2016/5/9/chartex" xmlns:cx4="http://schemas.microsoft.com/office/drawing/2016/5/10/chartex" xmlns:cx5="http://schemas.microsoft.com/office/drawing/2016/5/11/chartex" xmlns:cx6="http://schemas.microsoft.com/office/drawing/2016/5/12/chartex" xmlns:cx7="http://schemas.microsoft.com/office/drawing/2016/5/13/chartex" xmlns:cx8="http://schemas.microsoft.com/office/drawing/2016/5/14/chartex" xmlns:mc="http://schemas.openxmlformats.org/markup-compatibility/2006" xmlns:aink="http://schemas.microsoft.com/office/drawing/2016/ink" xmlns:am3d="http://schemas.microsoft.com/office/drawing/2017/model3d" xmlns:o="urn:schemas-microsoft-com:office:office" xmlns:oel="http://schemas.microsoft.com/office/2019/extlst" xmlns:r="http://schemas.openxmlformats.org/officeDocument/2006/relationships" xmlns:m="http://schemas.openxmlformats.org/officeDocument/2006/math" xmlns:v="urn:schemas-microsoft-com:vml" xmlns:wp14="http://schemas.microsoft.com/office/word/2010/wordprocessingDrawing" xmlns:wp="http://schemas.openxmlformats.org/drawingml/2006/wordprocessingDrawing" xmlns:w10="urn:schemas-microsoft-com:office:word" xmlns:w="http://schemas.openxmlformats.org/wordprocessingml/2006/main" xmlns:w14="http://schemas.microsoft.com/office/word/2010/wordml" xmlns:w15="http://schemas.microsoft.com/office/word/2012/wordml" xmlns:w16cex="http://schemas.microsoft.com/office/word/2018/wordml/cex" xmlns:w16cid="http://schemas.microsoft.com/office/word/2016/wordml/cid" xmlns:w16="http://schemas.microsoft.com/office/word/2018/wordml" xmlns:w16du="http://schemas.microsoft.com/office/word/2023/wordml/word16du" xmlns:w16sdtdh="http://schemas.microsoft.com/office/word/2020/wordml/sdtdatahash" xmlns:w16sdtfl="http://schemas.microsoft.com/office/word/2024/wordml/sdtformatlock" xmlns:w16se="http://schemas.microsoft.com/office/word/2015/wordml/symex" xmlns:wpg="http://schemas.microsoft.com/office/word/2010/wordprocessingGroup" xmlns:wpi="http://schemas.microsoft.com/office/word/2010/wordprocessingInk" xmlns:wne="http://schemas.microsoft.com/office/word/2006/wordml" xmlns:wps="http://schemas.microsoft.com/office/word/2010/wordprocessingShape" mc:Ignorable="w14 w15 w16se w16cid w16 w16cex w16sdtdh w16sdtfl w16du wp14">
+<w:document xmlns:wpc="http://schemas.microsoft.com/office/word/2010/wordprocessingCanvas" xmlns:cx="http://schemas.microsoft.com/office/drawing/2014/chartex" xmlns:mc="http://schemas.openxmlformats.org/markup-compatibility/2006" xmlns:o="urn:schemas-microsoft-com:office:office" xmlns:r="http://schemas.openxmlformats.org/officeDocument/2006/relationships" xmlns:m="http://schemas.openxmlformats.org/officeDocument/2006/math" xmlns:v="urn:schemas-microsoft-com:vml" xmlns:wp14="http://schemas.microsoft.com/office/word/2010/wordprocessingDrawing" xmlns:wp="http://schemas.openxmlformats.org/drawingml/2006/wordprocessingDrawing" xmlns:w10="urn:schemas-microsoft-com:office:word" xmlns:w="http://schemas.openxmlformats.org/wordprocessingml/2006/main" xmlns:w14="http://schemas.microsoft.com/office/word/2010/wordml" xmlns:w15="http://schemas.microsoft.com/office/word/2012/wordml" xmlns:w16se="http://schemas.microsoft.com/office/word/2015/wordml/symex" xmlns:wpg="http://schemas.microsoft.com/office/word/2010/wordprocessingGroup" xmlns:wpi="http://schemas.microsoft.com/office/word/2010/wordprocessingInk" xmlns:wne="http://schemas.microsoft.com/office/word/2006/wordml" xmlns:wps="http://schemas.microsoft.com/office/word/2010/wordprocessingShape" mc:Ignorable="w14 w15 w16se wp14">
   <w:body>
     <w:p>
       <w:pPr>
@@ -198,12 +198,6 @@
                 <w:lang w:val="fr-FR"/>
               </w:rPr>
               <w:br/>
-            </w:r>
-            <w:r>
-              <w:rPr>
-                <w:sz w:val="22"/>
-                <w:lang w:val="fr-FR"/>
-              </w:rPr>
               <w:t>Brian ANTOINE</w:t>
             </w:r>
           </w:p>
@@ -288,7 +282,7 @@
     </w:p>
     <w:p>
       <w:pPr>
-        <w:pStyle w:val="Titre1"/>
+        <w:pStyle w:val="Heading1"/>
         <w:spacing w:before="360" w:after="160"/>
       </w:pPr>
       <w:r>
@@ -873,7 +867,7 @@
     </w:p>
     <w:p>
       <w:pPr>
-        <w:pStyle w:val="Titre1"/>
+        <w:pStyle w:val="Heading1"/>
         <w:spacing w:before="360" w:after="160"/>
       </w:pPr>
       <w:r>
@@ -1557,7 +1551,7 @@
     </w:p>
     <w:p>
       <w:pPr>
-        <w:pStyle w:val="Titre1"/>
+        <w:pStyle w:val="Heading1"/>
         <w:spacing w:before="360" w:after="160"/>
         <w:rPr>
           <w:lang w:val="fr-FR"/>
@@ -1584,13 +1578,7 @@
         <w:rPr>
           <w:lang w:val="fr-FR"/>
         </w:rPr>
-        <w:t>Dans le cadre des réseaux d'entreprise modernes, l'interconnexion sécurisée des sites distants est essentielle. L'utilisation d'Internet pour acheminer des flux privés expose les données à des risques majeurs d'interception et d'altération. Pour y remédier, le VPN (Virtual Private Network) s'appuyant sur IPsec (Internet Protocol Security) s'impose comme la solution industrielle de référence, garantissant la confidentialité, l'intégrité et l'authenticité des flux sans le coût élevé de lignes physiques dédiée</w:t>
-      </w:r>
-      <w:r>
-        <w:rPr>
-          <w:lang w:val="fr-FR"/>
-        </w:rPr>
-        <w:t>s.</w:t>
+        <w:t>Dans le cadre des réseaux d'entreprise modernes, l'interconnexion sécurisée des sites distants est essentielle. L'utilisation d'Internet pour acheminer des flux privés expose les données à des risques majeurs d'interception et d'altération. Pour y remédier, le VPN (Virtual Private Network) s'appuyant sur IPsec (Internet Protocol Security) s'impose comme la solution industrielle de référence, garantissant la confidentialité, l'intégrité et l'authenticité des flux sans le coût élevé de lignes physiques dédiées.</w:t>
       </w:r>
     </w:p>
     <w:p>
@@ -1617,7 +1605,7 @@
     </w:p>
     <w:p>
       <w:pPr>
-        <w:pStyle w:val="Titre1"/>
+        <w:pStyle w:val="Heading1"/>
         <w:spacing w:before="360" w:after="160"/>
         <w:rPr>
           <w:lang w:val="fr-FR"/>
@@ -1633,7 +1621,7 @@
     </w:p>
     <w:p>
       <w:pPr>
-        <w:pStyle w:val="Titre2"/>
+        <w:pStyle w:val="Heading2"/>
         <w:spacing w:before="280" w:after="120"/>
         <w:rPr>
           <w:lang w:val="fr-FR"/>
@@ -1664,7 +1652,7 @@
     </w:p>
     <w:p>
       <w:pPr>
-        <w:pStyle w:val="Titre2"/>
+        <w:pStyle w:val="Heading2"/>
         <w:spacing w:before="280" w:after="120"/>
       </w:pPr>
       <w:r>
@@ -1676,7 +1664,7 @@
     </w:p>
     <w:p>
       <w:pPr>
-        <w:pStyle w:val="Listepuces"/>
+        <w:pStyle w:val="ListBullet"/>
         <w:spacing w:after="80"/>
         <w:jc w:val="both"/>
         <w:rPr>
@@ -1699,7 +1687,7 @@
     </w:p>
     <w:p>
       <w:pPr>
-        <w:pStyle w:val="Listepuces"/>
+        <w:pStyle w:val="ListBullet"/>
         <w:spacing w:after="80"/>
         <w:jc w:val="both"/>
         <w:rPr>
@@ -1722,7 +1710,7 @@
     </w:p>
     <w:p>
       <w:pPr>
-        <w:pStyle w:val="Listepuces"/>
+        <w:pStyle w:val="ListBullet"/>
         <w:spacing w:after="80"/>
         <w:jc w:val="both"/>
         <w:rPr>
@@ -1745,7 +1733,7 @@
     </w:p>
     <w:p>
       <w:pPr>
-        <w:pStyle w:val="Listepuces"/>
+        <w:pStyle w:val="ListBullet"/>
         <w:spacing w:after="80"/>
         <w:jc w:val="both"/>
         <w:rPr>
@@ -1768,7 +1756,7 @@
     </w:p>
     <w:p>
       <w:pPr>
-        <w:pStyle w:val="Listepuces"/>
+        <w:pStyle w:val="ListBullet"/>
         <w:spacing w:after="80"/>
         <w:jc w:val="both"/>
         <w:rPr>
@@ -1791,7 +1779,7 @@
     </w:p>
     <w:p>
       <w:pPr>
-        <w:pStyle w:val="Listepuces"/>
+        <w:pStyle w:val="ListBullet"/>
         <w:spacing w:after="80"/>
         <w:jc w:val="both"/>
         <w:rPr>
@@ -1814,7 +1802,7 @@
     </w:p>
     <w:p>
       <w:pPr>
-        <w:pStyle w:val="Listepuces"/>
+        <w:pStyle w:val="ListBullet"/>
         <w:spacing w:after="80"/>
         <w:jc w:val="both"/>
         <w:rPr>
@@ -1850,7 +1838,7 @@
     </w:p>
     <w:p>
       <w:pPr>
-        <w:pStyle w:val="Titre1"/>
+        <w:pStyle w:val="Heading1"/>
         <w:spacing w:before="360" w:after="160"/>
         <w:rPr>
           <w:lang w:val="fr-FR"/>
@@ -1904,7 +1892,7 @@
     </w:p>
     <w:p>
       <w:pPr>
-        <w:pStyle w:val="Titre1"/>
+        <w:pStyle w:val="Heading1"/>
         <w:spacing w:before="360" w:after="160"/>
         <w:rPr>
           <w:lang w:val="fr-FR"/>
@@ -1935,7 +1923,7 @@
     </w:p>
     <w:p>
       <w:pPr>
-        <w:pStyle w:val="Listepuces"/>
+        <w:pStyle w:val="ListBullet"/>
         <w:spacing w:after="80"/>
         <w:jc w:val="both"/>
         <w:rPr>
@@ -1958,7 +1946,7 @@
     </w:p>
     <w:p>
       <w:pPr>
-        <w:pStyle w:val="Listepuces"/>
+        <w:pStyle w:val="ListBullet"/>
         <w:spacing w:after="80"/>
         <w:jc w:val="both"/>
         <w:rPr>
@@ -1981,7 +1969,7 @@
     </w:p>
     <w:p>
       <w:pPr>
-        <w:pStyle w:val="Listepuces"/>
+        <w:pStyle w:val="ListBullet"/>
         <w:spacing w:after="80"/>
         <w:jc w:val="both"/>
         <w:rPr>
@@ -2004,7 +1992,7 @@
     </w:p>
     <w:p>
       <w:pPr>
-        <w:pStyle w:val="Listepuces"/>
+        <w:pStyle w:val="ListBullet"/>
         <w:spacing w:after="80"/>
         <w:jc w:val="both"/>
         <w:rPr>
@@ -2027,7 +2015,7 @@
     </w:p>
     <w:p>
       <w:pPr>
-        <w:pStyle w:val="Listepuces"/>
+        <w:pStyle w:val="ListBullet"/>
         <w:spacing w:after="80"/>
         <w:jc w:val="both"/>
         <w:rPr>
@@ -2063,7 +2051,7 @@
     </w:p>
     <w:p>
       <w:pPr>
-        <w:pStyle w:val="Titre1"/>
+        <w:pStyle w:val="Heading1"/>
         <w:spacing w:before="360" w:after="160"/>
         <w:rPr>
           <w:lang w:val="fr-FR"/>
@@ -2095,7 +2083,7 @@
     </w:p>
     <w:p>
       <w:pPr>
-        <w:pStyle w:val="Listepuces"/>
+        <w:pStyle w:val="ListBullet"/>
         <w:spacing w:after="80"/>
         <w:jc w:val="both"/>
         <w:rPr>
@@ -2118,7 +2106,7 @@
     </w:p>
     <w:p>
       <w:pPr>
-        <w:pStyle w:val="Listepuces"/>
+        <w:pStyle w:val="ListBullet"/>
         <w:spacing w:after="80"/>
         <w:jc w:val="both"/>
         <w:rPr>
@@ -2141,7 +2129,7 @@
     </w:p>
     <w:p>
       <w:pPr>
-        <w:pStyle w:val="Listepuces"/>
+        <w:pStyle w:val="ListBullet"/>
         <w:spacing w:after="80"/>
         <w:jc w:val="both"/>
         <w:rPr>
@@ -2164,7 +2152,7 @@
     </w:p>
     <w:p>
       <w:pPr>
-        <w:pStyle w:val="Listepuces"/>
+        <w:pStyle w:val="ListBullet"/>
         <w:spacing w:after="80"/>
         <w:jc w:val="both"/>
         <w:rPr>
@@ -2187,7 +2175,7 @@
     </w:p>
     <w:p>
       <w:pPr>
-        <w:pStyle w:val="Listepuces"/>
+        <w:pStyle w:val="ListBullet"/>
         <w:spacing w:after="80"/>
         <w:jc w:val="both"/>
         <w:rPr>
@@ -2210,7 +2198,7 @@
     </w:p>
     <w:p>
       <w:pPr>
-        <w:pStyle w:val="Listepuces"/>
+        <w:pStyle w:val="ListBullet"/>
         <w:spacing w:after="80"/>
         <w:jc w:val="both"/>
         <w:rPr>
@@ -2240,7 +2228,7 @@
     </w:p>
     <w:p>
       <w:pPr>
-        <w:pStyle w:val="Titre1"/>
+        <w:pStyle w:val="Heading1"/>
         <w:spacing w:before="360" w:after="160"/>
         <w:rPr>
           <w:lang w:val="fr-FR"/>
@@ -2281,26 +2269,12 @@
         <w:rPr>
           <w:lang w:val="fr-FR"/>
         </w:rPr>
-        <w:t xml:space="preserve">Afin d'isoler le trafic privé du FAI et des tiers, un tunnel cryptographique IPsec est configuré de manière exclusive entre les routeurs frontières R1 et R3. Les paquets privés transitant d'un site à un autre </w:t>
-      </w:r>
-      <w:proofErr w:type="gramStart"/>
-      <w:r>
-        <w:rPr>
-          <w:lang w:val="fr-FR"/>
-        </w:rPr>
-        <w:t>sont</w:t>
-      </w:r>
-      <w:proofErr w:type="gramEnd"/>
-      <w:r>
-        <w:rPr>
-          <w:lang w:val="fr-FR"/>
-        </w:rPr>
-        <w:t xml:space="preserve"> intégralement chiffrés et masqués avant d'être acheminés sur le WAN.</w:t>
+        <w:t>Afin d'isoler le trafic privé du FAI et des tiers, un tunnel cryptographique IPsec est configuré de manière exclusive entre les routeurs frontières R1 et R3. Les paquets privés transitant d'un site à un autre sont intégralement chiffrés et masqués avant d'être acheminés sur le WAN.</w:t>
       </w:r>
     </w:p>
     <w:p>
       <w:pPr>
-        <w:pStyle w:val="Titre2"/>
+        <w:pStyle w:val="Heading2"/>
         <w:spacing w:before="280" w:after="120"/>
         <w:rPr>
           <w:lang w:val="fr-FR"/>
@@ -3260,7 +3234,7 @@
     </w:p>
     <w:p>
       <w:pPr>
-        <w:pStyle w:val="Titre1"/>
+        <w:pStyle w:val="Heading1"/>
         <w:spacing w:before="360" w:after="160"/>
       </w:pPr>
       <w:r>
@@ -3288,7 +3262,7 @@
     </w:p>
     <w:p>
       <w:pPr>
-        <w:pStyle w:val="Titre2"/>
+        <w:pStyle w:val="Heading2"/>
         <w:spacing w:before="280" w:after="120"/>
         <w:rPr>
           <w:lang w:val="fr-FR"/>
@@ -3326,6 +3300,7 @@
       <w:r>
         <w:rPr>
           <w:noProof/>
+          <w:lang w:val="fr-FR" w:eastAsia="fr-FR"/>
         </w:rPr>
         <w:drawing>
           <wp:inline distT="0" distB="0" distL="0" distR="0" wp14:anchorId="33AF7D5B" wp14:editId="6E68D736">
@@ -3392,7 +3367,7 @@
     </w:p>
     <w:p>
       <w:pPr>
-        <w:pStyle w:val="Titre2"/>
+        <w:pStyle w:val="Heading2"/>
         <w:spacing w:before="280" w:after="120"/>
         <w:rPr>
           <w:lang w:val="fr-FR"/>
@@ -3430,6 +3405,7 @@
       <w:r>
         <w:rPr>
           <w:noProof/>
+          <w:lang w:val="fr-FR" w:eastAsia="fr-FR"/>
         </w:rPr>
         <w:lastRenderedPageBreak/>
         <w:drawing>
@@ -3504,6 +3480,7 @@
       <w:r>
         <w:rPr>
           <w:noProof/>
+          <w:lang w:val="fr-FR" w:eastAsia="fr-FR"/>
         </w:rPr>
         <w:lastRenderedPageBreak/>
         <w:drawing>
@@ -3578,6 +3555,7 @@
       <w:r>
         <w:rPr>
           <w:noProof/>
+          <w:lang w:val="fr-FR" w:eastAsia="fr-FR"/>
         </w:rPr>
         <w:lastRenderedPageBreak/>
         <w:drawing>
@@ -3652,6 +3630,7 @@
       <w:r>
         <w:rPr>
           <w:noProof/>
+          <w:lang w:val="fr-FR" w:eastAsia="fr-FR"/>
         </w:rPr>
         <w:lastRenderedPageBreak/>
         <w:drawing>
@@ -3726,6 +3705,7 @@
       <w:r>
         <w:rPr>
           <w:noProof/>
+          <w:lang w:val="fr-FR" w:eastAsia="fr-FR"/>
         </w:rPr>
         <w:lastRenderedPageBreak/>
         <w:drawing>
@@ -3800,6 +3780,7 @@
       <w:r>
         <w:rPr>
           <w:noProof/>
+          <w:lang w:val="fr-FR" w:eastAsia="fr-FR"/>
         </w:rPr>
         <w:lastRenderedPageBreak/>
         <w:drawing>
@@ -3867,7 +3848,7 @@
     </w:p>
     <w:p>
       <w:pPr>
-        <w:pStyle w:val="Titre2"/>
+        <w:pStyle w:val="Heading2"/>
         <w:spacing w:before="280" w:after="120"/>
         <w:rPr>
           <w:lang w:val="fr-FR"/>
@@ -3905,6 +3886,7 @@
       <w:r>
         <w:rPr>
           <w:noProof/>
+          <w:lang w:val="fr-FR" w:eastAsia="fr-FR"/>
         </w:rPr>
         <w:lastRenderedPageBreak/>
         <w:drawing>
@@ -3972,7 +3954,7 @@
     </w:p>
     <w:p>
       <w:pPr>
-        <w:pStyle w:val="Titre2"/>
+        <w:pStyle w:val="Heading2"/>
         <w:spacing w:before="280" w:after="120"/>
         <w:rPr>
           <w:lang w:val="fr-FR"/>
@@ -4010,6 +3992,7 @@
       <w:r>
         <w:rPr>
           <w:noProof/>
+          <w:lang w:val="fr-FR" w:eastAsia="fr-FR"/>
         </w:rPr>
         <w:lastRenderedPageBreak/>
         <w:drawing>
@@ -4099,6 +4082,7 @@
       <w:r>
         <w:rPr>
           <w:noProof/>
+          <w:lang w:val="fr-FR" w:eastAsia="fr-FR"/>
         </w:rPr>
         <w:lastRenderedPageBreak/>
         <w:drawing>
@@ -4166,7 +4150,7 @@
     </w:p>
     <w:p>
       <w:pPr>
-        <w:pStyle w:val="Titre2"/>
+        <w:pStyle w:val="Heading2"/>
         <w:spacing w:before="280" w:after="120"/>
         <w:rPr>
           <w:lang w:val="fr-FR"/>
@@ -4204,6 +4188,7 @@
       <w:r>
         <w:rPr>
           <w:noProof/>
+          <w:lang w:val="fr-FR" w:eastAsia="fr-FR"/>
         </w:rPr>
         <w:lastRenderedPageBreak/>
         <w:drawing>
@@ -4271,7 +4256,7 @@
     </w:p>
     <w:p>
       <w:pPr>
-        <w:pStyle w:val="Titre2"/>
+        <w:pStyle w:val="Heading2"/>
         <w:spacing w:before="280" w:after="120"/>
         <w:rPr>
           <w:lang w:val="fr-FR"/>
@@ -4309,6 +4294,7 @@
       <w:r>
         <w:rPr>
           <w:noProof/>
+          <w:lang w:val="fr-FR" w:eastAsia="fr-FR"/>
         </w:rPr>
         <w:lastRenderedPageBreak/>
         <w:drawing>
@@ -4376,7 +4362,7 @@
     </w:p>
     <w:p>
       <w:pPr>
-        <w:pStyle w:val="Titre2"/>
+        <w:pStyle w:val="Heading2"/>
         <w:spacing w:before="280" w:after="120"/>
         <w:rPr>
           <w:lang w:val="fr-FR"/>
@@ -4414,6 +4400,7 @@
       <w:r>
         <w:rPr>
           <w:noProof/>
+          <w:lang w:val="fr-FR" w:eastAsia="fr-FR"/>
         </w:rPr>
         <w:lastRenderedPageBreak/>
         <w:drawing>
@@ -4488,6 +4475,7 @@
       <w:r>
         <w:rPr>
           <w:noProof/>
+          <w:lang w:val="fr-FR" w:eastAsia="fr-FR"/>
         </w:rPr>
         <w:drawing>
           <wp:inline distT="0" distB="0" distL="0" distR="0" wp14:anchorId="67B53B9E" wp14:editId="2EBD1B1B">
@@ -4561,6 +4549,7 @@
       <w:r>
         <w:rPr>
           <w:noProof/>
+          <w:lang w:val="fr-FR" w:eastAsia="fr-FR"/>
         </w:rPr>
         <w:lastRenderedPageBreak/>
         <w:drawing>
@@ -4628,7 +4617,7 @@
     </w:p>
     <w:p>
       <w:pPr>
-        <w:pStyle w:val="Titre2"/>
+        <w:pStyle w:val="Heading2"/>
         <w:spacing w:before="280" w:after="120"/>
         <w:rPr>
           <w:lang w:val="fr-FR"/>
@@ -4666,6 +4655,7 @@
       <w:r>
         <w:rPr>
           <w:noProof/>
+          <w:lang w:val="fr-FR" w:eastAsia="fr-FR"/>
         </w:rPr>
         <w:lastRenderedPageBreak/>
         <w:drawing>
@@ -4755,6 +4745,7 @@
       <w:r>
         <w:rPr>
           <w:noProof/>
+          <w:lang w:val="fr-FR" w:eastAsia="fr-FR"/>
         </w:rPr>
         <w:lastRenderedPageBreak/>
         <w:drawing>
@@ -4829,6 +4820,7 @@
       <w:r>
         <w:rPr>
           <w:noProof/>
+          <w:lang w:val="fr-FR" w:eastAsia="fr-FR"/>
         </w:rPr>
         <w:lastRenderedPageBreak/>
         <w:drawing>
@@ -4918,6 +4910,7 @@
       <w:r>
         <w:rPr>
           <w:noProof/>
+          <w:lang w:val="fr-FR" w:eastAsia="fr-FR"/>
         </w:rPr>
         <w:lastRenderedPageBreak/>
         <w:drawing>
@@ -4998,7 +4991,7 @@
     </w:p>
     <w:p>
       <w:pPr>
-        <w:pStyle w:val="Titre1"/>
+        <w:pStyle w:val="Heading1"/>
         <w:spacing w:before="360" w:after="160"/>
         <w:rPr>
           <w:lang w:val="fr-FR"/>
@@ -5030,7 +5023,7 @@
     </w:p>
     <w:p>
       <w:pPr>
-        <w:pStyle w:val="Listepuces"/>
+        <w:pStyle w:val="ListBullet"/>
         <w:spacing w:after="80"/>
         <w:jc w:val="both"/>
         <w:rPr>
@@ -5053,7 +5046,7 @@
     </w:p>
     <w:p>
       <w:pPr>
-        <w:pStyle w:val="Listepuces"/>
+        <w:pStyle w:val="ListBullet"/>
         <w:spacing w:after="80"/>
         <w:jc w:val="both"/>
         <w:rPr>
@@ -5076,7 +5069,7 @@
     </w:p>
     <w:p>
       <w:pPr>
-        <w:pStyle w:val="Listepuces"/>
+        <w:pStyle w:val="ListBullet"/>
         <w:spacing w:after="80"/>
         <w:jc w:val="both"/>
         <w:rPr>
@@ -5106,7 +5099,7 @@
     </w:p>
     <w:p>
       <w:pPr>
-        <w:pStyle w:val="Titre1"/>
+        <w:pStyle w:val="Heading1"/>
         <w:spacing w:before="360" w:after="160"/>
         <w:rPr>
           <w:lang w:val="fr-FR"/>
@@ -5137,7 +5130,7 @@
     </w:p>
     <w:p>
       <w:pPr>
-        <w:pStyle w:val="Listepuces"/>
+        <w:pStyle w:val="ListBullet"/>
         <w:spacing w:after="80"/>
         <w:jc w:val="both"/>
         <w:rPr>
@@ -5160,7 +5153,7 @@
     </w:p>
     <w:p>
       <w:pPr>
-        <w:pStyle w:val="Listepuces"/>
+        <w:pStyle w:val="ListBullet"/>
         <w:spacing w:after="80"/>
         <w:jc w:val="both"/>
         <w:rPr>
@@ -5183,7 +5176,7 @@
     </w:p>
     <w:p>
       <w:pPr>
-        <w:pStyle w:val="Listepuces"/>
+        <w:pStyle w:val="ListBullet"/>
         <w:spacing w:after="80"/>
         <w:jc w:val="both"/>
         <w:rPr>
@@ -5206,7 +5199,7 @@
     </w:p>
     <w:p>
       <w:pPr>
-        <w:pStyle w:val="Listepuces"/>
+        <w:pStyle w:val="ListBullet"/>
         <w:spacing w:after="80"/>
         <w:jc w:val="both"/>
         <w:rPr>
@@ -5236,22 +5229,31 @@
     </w:p>
     <w:p>
       <w:pPr>
-        <w:pStyle w:val="Titre1"/>
-        <w:spacing w:before="360" w:after="160"/>
-        <w:rPr>
-          <w:lang w:val="fr-FR"/>
-        </w:rPr>
-      </w:pPr>
-      <w:r>
-        <w:rPr>
-          <w:rFonts w:ascii="Arial" w:hAnsi="Arial"/>
-          <w:lang w:val="fr-FR"/>
-        </w:rPr>
-        <w:t>Conclusion</w:t>
-      </w:r>
+        <w:rPr>
+          <w:lang w:val="fr-FR"/>
+        </w:rPr>
+      </w:pPr>
+      <w:bookmarkStart w:id="0" w:name="_GoBack"/>
+      <w:bookmarkEnd w:id="0"/>
     </w:p>
     <w:p>
       <w:pPr>
+        <w:pStyle w:val="Heading1"/>
+        <w:spacing w:before="360" w:after="160"/>
+        <w:rPr>
+          <w:lang w:val="fr-FR"/>
+        </w:rPr>
+      </w:pPr>
+      <w:r>
+        <w:rPr>
+          <w:rFonts w:ascii="Arial" w:hAnsi="Arial"/>
+          <w:lang w:val="fr-FR"/>
+        </w:rPr>
+        <w:t>Conclusion</w:t>
+      </w:r>
+    </w:p>
+    <w:p>
+      <w:pPr>
         <w:spacing w:after="120"/>
         <w:jc w:val="both"/>
         <w:rPr>
@@ -5289,7 +5291,7 @@
     </w:p>
     <w:p>
       <w:pPr>
-        <w:pStyle w:val="Titre1"/>
+        <w:pStyle w:val="Heading1"/>
         <w:spacing w:before="360" w:after="160"/>
         <w:rPr>
           <w:lang w:val="fr-FR"/>
@@ -5438,7 +5440,7 @@
 </file>
 
 <file path=word/numbering.xml><?xml version="1.0" encoding="utf-8"?>
-<w:numbering xmlns:wpc="http://schemas.microsoft.com/office/word/2010/wordprocessingCanvas" xmlns:cx="http://schemas.microsoft.com/office/drawing/2014/chartex" xmlns:cx1="http://schemas.microsoft.com/office/drawing/2015/9/8/chartex" xmlns:cx2="http://schemas.microsoft.com/office/drawing/2015/10/21/chartex" xmlns:cx3="http://schemas.microsoft.com/office/drawing/2016/5/9/chartex" xmlns:cx4="http://schemas.microsoft.com/office/drawing/2016/5/10/chartex" xmlns:cx5="http://schemas.microsoft.com/office/drawing/2016/5/11/chartex" xmlns:cx6="http://schemas.microsoft.com/office/drawing/2016/5/12/chartex" xmlns:cx7="http://schemas.microsoft.com/office/drawing/2016/5/13/chartex" xmlns:cx8="http://schemas.microsoft.com/office/drawing/2016/5/14/chartex" xmlns:mc="http://schemas.openxmlformats.org/markup-compatibility/2006" xmlns:aink="http://schemas.microsoft.com/office/drawing/2016/ink" xmlns:am3d="http://schemas.microsoft.com/office/drawing/2017/model3d" xmlns:o="urn:schemas-microsoft-com:office:office" xmlns:oel="http://schemas.microsoft.com/office/2019/extlst" xmlns:r="http://schemas.openxmlformats.org/officeDocument/2006/relationships" xmlns:m="http://schemas.openxmlformats.org/officeDocument/2006/math" xmlns:v="urn:schemas-microsoft-com:vml" xmlns:wp14="http://schemas.microsoft.com/office/word/2010/wordprocessingDrawing" xmlns:wp="http://schemas.openxmlformats.org/drawingml/2006/wordprocessingDrawing" xmlns:w10="urn:schemas-microsoft-com:office:word" xmlns:w="http://schemas.openxmlformats.org/wordprocessingml/2006/main" xmlns:w14="http://schemas.microsoft.com/office/word/2010/wordml" xmlns:w15="http://schemas.microsoft.com/office/word/2012/wordml" xmlns:w16cex="http://schemas.microsoft.com/office/word/2018/wordml/cex" xmlns:w16cid="http://schemas.microsoft.com/office/word/2016/wordml/cid" xmlns:w16="http://schemas.microsoft.com/office/word/2018/wordml" xmlns:w16du="http://schemas.microsoft.com/office/word/2023/wordml/word16du" xmlns:w16sdtdh="http://schemas.microsoft.com/office/word/2020/wordml/sdtdatahash" xmlns:w16sdtfl="http://schemas.microsoft.com/office/word/2024/wordml/sdtformatlock" xmlns:w16se="http://schemas.microsoft.com/office/word/2015/wordml/symex" xmlns:wpg="http://schemas.microsoft.com/office/word/2010/wordprocessingGroup" xmlns:wpi="http://schemas.microsoft.com/office/word/2010/wordprocessingInk" xmlns:wne="http://schemas.microsoft.com/office/word/2006/wordml" xmlns:wps="http://schemas.microsoft.com/office/word/2010/wordprocessingShape" mc:Ignorable="w14 w15 w16se w16cid w16 w16cex w16sdtdh w16sdtfl w16du wp14">
+<w:numbering xmlns:wpc="http://schemas.microsoft.com/office/word/2010/wordprocessingCanvas" xmlns:cx="http://schemas.microsoft.com/office/drawing/2014/chartex" xmlns:mc="http://schemas.openxmlformats.org/markup-compatibility/2006" xmlns:o="urn:schemas-microsoft-com:office:office" xmlns:r="http://schemas.openxmlformats.org/officeDocument/2006/relationships" xmlns:m="http://schemas.openxmlformats.org/officeDocument/2006/math" xmlns:v="urn:schemas-microsoft-com:vml" xmlns:wp14="http://schemas.microsoft.com/office/word/2010/wordprocessingDrawing" xmlns:wp="http://schemas.openxmlformats.org/drawingml/2006/wordprocessingDrawing" xmlns:w10="urn:schemas-microsoft-com:office:word" xmlns:w="http://schemas.openxmlformats.org/wordprocessingml/2006/main" xmlns:w14="http://schemas.microsoft.com/office/word/2010/wordml" xmlns:w15="http://schemas.microsoft.com/office/word/2012/wordml" xmlns:w16se="http://schemas.microsoft.com/office/word/2015/wordml/symex" xmlns:wpg="http://schemas.microsoft.com/office/word/2010/wordprocessingGroup" xmlns:wpi="http://schemas.microsoft.com/office/word/2010/wordprocessingInk" xmlns:wne="http://schemas.microsoft.com/office/word/2006/wordml" xmlns:wps="http://schemas.microsoft.com/office/word/2010/wordprocessingShape" mc:Ignorable="w14 w15 w16se wp14">
   <w:abstractNum w:abstractNumId="0" w15:restartNumberingAfterBreak="0">
     <w:nsid w:val="FFFFFF7C"/>
     <w:multiLevelType w:val="singleLevel"/>
@@ -5480,7 +5482,7 @@
     <w:lvl w:ilvl="0">
       <w:start w:val="1"/>
       <w:numFmt w:val="decimal"/>
-      <w:pStyle w:val="Listenumros3"/>
+      <w:pStyle w:val="ListNumber3"/>
       <w:lvlText w:val="%1."/>
       <w:lvlJc w:val="left"/>
       <w:pPr>
@@ -5498,7 +5500,7 @@
     <w:lvl w:ilvl="0">
       <w:start w:val="1"/>
       <w:numFmt w:val="decimal"/>
-      <w:pStyle w:val="Listenumros2"/>
+      <w:pStyle w:val="ListNumber2"/>
       <w:lvlText w:val="%1."/>
       <w:lvlJc w:val="left"/>
       <w:pPr>
@@ -5536,7 +5538,7 @@
     <w:lvl w:ilvl="0">
       <w:start w:val="1"/>
       <w:numFmt w:val="bullet"/>
-      <w:pStyle w:val="Listepuces3"/>
+      <w:pStyle w:val="ListBullet3"/>
       <w:lvlText w:val=""/>
       <w:lvlJc w:val="left"/>
       <w:pPr>
@@ -5557,7 +5559,7 @@
     <w:lvl w:ilvl="0">
       <w:start w:val="1"/>
       <w:numFmt w:val="bullet"/>
-      <w:pStyle w:val="Listepuces2"/>
+      <w:pStyle w:val="ListBullet2"/>
       <w:lvlText w:val=""/>
       <w:lvlJc w:val="left"/>
       <w:pPr>
@@ -5578,7 +5580,7 @@
     <w:lvl w:ilvl="0">
       <w:start w:val="1"/>
       <w:numFmt w:val="decimal"/>
-      <w:pStyle w:val="Listenumros"/>
+      <w:pStyle w:val="ListNumber"/>
       <w:lvlText w:val="%1."/>
       <w:lvlJc w:val="left"/>
       <w:pPr>
@@ -5596,7 +5598,7 @@
     <w:lvl w:ilvl="0">
       <w:start w:val="1"/>
       <w:numFmt w:val="bullet"/>
-      <w:pStyle w:val="Listepuces"/>
+      <w:pStyle w:val="ListBullet"/>
       <w:lvlText w:val=""/>
       <w:lvlJc w:val="left"/>
       <w:pPr>
@@ -5610,38 +5612,38 @@
       </w:rPr>
     </w:lvl>
   </w:abstractNum>
-  <w:num w:numId="1" w16cid:durableId="838926954">
+  <w:num w:numId="1">
     <w:abstractNumId w:val="8"/>
   </w:num>
-  <w:num w:numId="2" w16cid:durableId="1264801670">
+  <w:num w:numId="2">
     <w:abstractNumId w:val="6"/>
   </w:num>
-  <w:num w:numId="3" w16cid:durableId="587691908">
+  <w:num w:numId="3">
     <w:abstractNumId w:val="5"/>
   </w:num>
-  <w:num w:numId="4" w16cid:durableId="974679711">
+  <w:num w:numId="4">
     <w:abstractNumId w:val="4"/>
   </w:num>
-  <w:num w:numId="5" w16cid:durableId="1888102767">
+  <w:num w:numId="5">
     <w:abstractNumId w:val="7"/>
   </w:num>
-  <w:num w:numId="6" w16cid:durableId="440149148">
+  <w:num w:numId="6">
     <w:abstractNumId w:val="3"/>
   </w:num>
-  <w:num w:numId="7" w16cid:durableId="236013266">
+  <w:num w:numId="7">
     <w:abstractNumId w:val="2"/>
   </w:num>
-  <w:num w:numId="8" w16cid:durableId="1352297171">
+  <w:num w:numId="8">
     <w:abstractNumId w:val="1"/>
   </w:num>
-  <w:num w:numId="9" w16cid:durableId="2005429965">
+  <w:num w:numId="9">
     <w:abstractNumId w:val="0"/>
   </w:num>
 </w:numbering>
 </file>
 
 <file path=word/styles.xml><?xml version="1.0" encoding="utf-8"?>
-<w:styles xmlns:mc="http://schemas.openxmlformats.org/markup-compatibility/2006" xmlns:r="http://schemas.openxmlformats.org/officeDocument/2006/relationships" xmlns:w="http://schemas.openxmlformats.org/wordprocessingml/2006/main" xmlns:w14="http://schemas.microsoft.com/office/word/2010/wordml" xmlns:w15="http://schemas.microsoft.com/office/word/2012/wordml" xmlns:w16cex="http://schemas.microsoft.com/office/word/2018/wordml/cex" xmlns:w16cid="http://schemas.microsoft.com/office/word/2016/wordml/cid" xmlns:w16="http://schemas.microsoft.com/office/word/2018/wordml" xmlns:w16du="http://schemas.microsoft.com/office/word/2023/wordml/word16du" xmlns:w16sdtdh="http://schemas.microsoft.com/office/word/2020/wordml/sdtdatahash" xmlns:w16sdtfl="http://schemas.microsoft.com/office/word/2024/wordml/sdtformatlock" xmlns:w16se="http://schemas.microsoft.com/office/word/2015/wordml/symex" mc:Ignorable="w14 w15 w16se w16cid w16 w16cex w16sdtdh w16sdtfl w16du">
+<w:styles xmlns:mc="http://schemas.openxmlformats.org/markup-compatibility/2006" xmlns:r="http://schemas.openxmlformats.org/officeDocument/2006/relationships" xmlns:w="http://schemas.openxmlformats.org/wordprocessingml/2006/main" xmlns:w14="http://schemas.microsoft.com/office/word/2010/wordml" xmlns:w15="http://schemas.microsoft.com/office/word/2012/wordml" xmlns:w16se="http://schemas.microsoft.com/office/word/2015/wordml/symex" mc:Ignorable="w14 w15 w16se">
   <w:docDefaults>
     <w:rPrDefault>
       <w:rPr>
@@ -5657,7 +5659,7 @@
       </w:pPr>
     </w:pPrDefault>
   </w:docDefaults>
-  <w:latentStyles w:defLockedState="0" w:defUIPriority="99" w:defSemiHidden="0" w:defUnhideWhenUsed="0" w:defQFormat="0" w:count="376">
+  <w:latentStyles w:defLockedState="0" w:defUIPriority="99" w:defSemiHidden="0" w:defUnhideWhenUsed="0" w:defQFormat="0" w:count="371">
     <w:lsdException w:name="Normal" w:uiPriority="0" w:qFormat="1"/>
     <w:lsdException w:name="heading 1" w:uiPriority="9" w:qFormat="1"/>
     <w:lsdException w:name="heading 2" w:semiHidden="1" w:uiPriority="9" w:unhideWhenUsed="1" w:qFormat="1"/>
@@ -6020,11 +6022,6 @@
     <w:lsdException w:name="List Table 5 Dark Accent 6" w:uiPriority="50"/>
     <w:lsdException w:name="List Table 6 Colorful Accent 6" w:uiPriority="51"/>
     <w:lsdException w:name="List Table 7 Colorful Accent 6" w:uiPriority="52"/>
-    <w:lsdException w:name="Mention" w:semiHidden="1" w:unhideWhenUsed="1"/>
-    <w:lsdException w:name="Smart Hyperlink" w:semiHidden="1" w:unhideWhenUsed="1"/>
-    <w:lsdException w:name="Hashtag" w:semiHidden="1" w:unhideWhenUsed="1"/>
-    <w:lsdException w:name="Unresolved Mention" w:semiHidden="1" w:unhideWhenUsed="1"/>
-    <w:lsdException w:name="Smart Link" w:semiHidden="1" w:unhideWhenUsed="1"/>
   </w:latentStyles>
   <w:style w:type="paragraph" w:default="1" w:styleId="Normal">
     <w:name w:val="Normal"/>
@@ -6036,11 +6033,11 @@
       <w:sz w:val="24"/>
     </w:rPr>
   </w:style>
-  <w:style w:type="paragraph" w:styleId="Titre1">
+  <w:style w:type="paragraph" w:styleId="Heading1">
     <w:name w:val="heading 1"/>
     <w:basedOn w:val="Normal"/>
     <w:next w:val="Normal"/>
-    <w:link w:val="Titre1Car"/>
+    <w:link w:val="Heading1Char"/>
     <w:uiPriority w:val="9"/>
     <w:qFormat/>
     <w:rsid w:val="00FC693F"/>
@@ -6058,11 +6055,11 @@
       <w:szCs w:val="28"/>
     </w:rPr>
   </w:style>
-  <w:style w:type="paragraph" w:styleId="Titre2">
+  <w:style w:type="paragraph" w:styleId="Heading2">
     <w:name w:val="heading 2"/>
     <w:basedOn w:val="Normal"/>
     <w:next w:val="Normal"/>
-    <w:link w:val="Titre2Car"/>
+    <w:link w:val="Heading2Char"/>
     <w:uiPriority w:val="9"/>
     <w:unhideWhenUsed/>
     <w:qFormat/>
@@ -6082,11 +6079,11 @@
       <w:szCs w:val="26"/>
     </w:rPr>
   </w:style>
-  <w:style w:type="paragraph" w:styleId="Titre3">
+  <w:style w:type="paragraph" w:styleId="Heading3">
     <w:name w:val="heading 3"/>
     <w:basedOn w:val="Normal"/>
     <w:next w:val="Normal"/>
-    <w:link w:val="Titre3Car"/>
+    <w:link w:val="Heading3Char"/>
     <w:uiPriority w:val="9"/>
     <w:unhideWhenUsed/>
     <w:qFormat/>
@@ -6103,11 +6100,11 @@
       <w:bCs/>
     </w:rPr>
   </w:style>
-  <w:style w:type="paragraph" w:styleId="Titre4">
+  <w:style w:type="paragraph" w:styleId="Heading4">
     <w:name w:val="heading 4"/>
     <w:basedOn w:val="Normal"/>
     <w:next w:val="Normal"/>
-    <w:link w:val="Titre4Car"/>
+    <w:link w:val="Heading4Char"/>
     <w:uiPriority w:val="9"/>
     <w:semiHidden/>
     <w:unhideWhenUsed/>
@@ -6128,11 +6125,11 @@
       <w:color w:val="4F81BD" w:themeColor="accent1"/>
     </w:rPr>
   </w:style>
-  <w:style w:type="paragraph" w:styleId="Titre5">
+  <w:style w:type="paragraph" w:styleId="Heading5">
     <w:name w:val="heading 5"/>
     <w:basedOn w:val="Normal"/>
     <w:next w:val="Normal"/>
-    <w:link w:val="Titre5Car"/>
+    <w:link w:val="Heading5Char"/>
     <w:uiPriority w:val="9"/>
     <w:semiHidden/>
     <w:unhideWhenUsed/>
@@ -6149,11 +6146,11 @@
       <w:color w:val="243F60" w:themeColor="accent1" w:themeShade="7F"/>
     </w:rPr>
   </w:style>
-  <w:style w:type="paragraph" w:styleId="Titre6">
+  <w:style w:type="paragraph" w:styleId="Heading6">
     <w:name w:val="heading 6"/>
     <w:basedOn w:val="Normal"/>
     <w:next w:val="Normal"/>
-    <w:link w:val="Titre6Car"/>
+    <w:link w:val="Heading6Char"/>
     <w:uiPriority w:val="9"/>
     <w:semiHidden/>
     <w:unhideWhenUsed/>
@@ -6172,11 +6169,11 @@
       <w:color w:val="243F60" w:themeColor="accent1" w:themeShade="7F"/>
     </w:rPr>
   </w:style>
-  <w:style w:type="paragraph" w:styleId="Titre7">
+  <w:style w:type="paragraph" w:styleId="Heading7">
     <w:name w:val="heading 7"/>
     <w:basedOn w:val="Normal"/>
     <w:next w:val="Normal"/>
-    <w:link w:val="Titre7Car"/>
+    <w:link w:val="Heading7Char"/>
     <w:uiPriority w:val="9"/>
     <w:semiHidden/>
     <w:unhideWhenUsed/>
@@ -6195,11 +6192,11 @@
       <w:color w:val="404040" w:themeColor="text1" w:themeTint="BF"/>
     </w:rPr>
   </w:style>
-  <w:style w:type="paragraph" w:styleId="Titre8">
+  <w:style w:type="paragraph" w:styleId="Heading8">
     <w:name w:val="heading 8"/>
     <w:basedOn w:val="Normal"/>
     <w:next w:val="Normal"/>
-    <w:link w:val="Titre8Car"/>
+    <w:link w:val="Heading8Char"/>
     <w:uiPriority w:val="9"/>
     <w:semiHidden/>
     <w:unhideWhenUsed/>
@@ -6218,11 +6215,11 @@
       <w:szCs w:val="20"/>
     </w:rPr>
   </w:style>
-  <w:style w:type="paragraph" w:styleId="Titre9">
+  <w:style w:type="paragraph" w:styleId="Heading9">
     <w:name w:val="heading 9"/>
     <w:basedOn w:val="Normal"/>
     <w:next w:val="Normal"/>
-    <w:link w:val="Titre9Car"/>
+    <w:link w:val="Heading9Char"/>
     <w:uiPriority w:val="9"/>
     <w:semiHidden/>
     <w:unhideWhenUsed/>
@@ -6243,13 +6240,13 @@
       <w:szCs w:val="20"/>
     </w:rPr>
   </w:style>
-  <w:style w:type="character" w:default="1" w:styleId="Policepardfaut">
+  <w:style w:type="character" w:default="1" w:styleId="DefaultParagraphFont">
     <w:name w:val="Default Paragraph Font"/>
     <w:uiPriority w:val="1"/>
     <w:semiHidden/>
     <w:unhideWhenUsed/>
   </w:style>
-  <w:style w:type="table" w:default="1" w:styleId="TableauNormal">
+  <w:style w:type="table" w:default="1" w:styleId="TableNormal">
     <w:name w:val="Normal Table"/>
     <w:uiPriority w:val="99"/>
     <w:semiHidden/>
@@ -6264,16 +6261,16 @@
       </w:tblCellMar>
     </w:tblPr>
   </w:style>
-  <w:style w:type="numbering" w:default="1" w:styleId="Aucuneliste">
+  <w:style w:type="numbering" w:default="1" w:styleId="NoList">
     <w:name w:val="No List"/>
     <w:uiPriority w:val="99"/>
     <w:semiHidden/>
     <w:unhideWhenUsed/>
   </w:style>
-  <w:style w:type="paragraph" w:styleId="En-tte">
+  <w:style w:type="paragraph" w:styleId="Header">
     <w:name w:val="header"/>
     <w:basedOn w:val="Normal"/>
-    <w:link w:val="En-tteCar"/>
+    <w:link w:val="HeaderChar"/>
     <w:uiPriority w:val="99"/>
     <w:unhideWhenUsed/>
     <w:rsid w:val="00E618BF"/>
@@ -6285,17 +6282,17 @@
       <w:spacing w:after="0" w:line="240" w:lineRule="auto"/>
     </w:pPr>
   </w:style>
-  <w:style w:type="character" w:customStyle="1" w:styleId="En-tteCar">
-    <w:name w:val="En-tête Car"/>
-    <w:basedOn w:val="Policepardfaut"/>
-    <w:link w:val="En-tte"/>
+  <w:style w:type="character" w:customStyle="1" w:styleId="HeaderChar">
+    <w:name w:val="Header Char"/>
+    <w:basedOn w:val="DefaultParagraphFont"/>
+    <w:link w:val="Header"/>
     <w:uiPriority w:val="99"/>
     <w:rsid w:val="00E618BF"/>
   </w:style>
-  <w:style w:type="paragraph" w:styleId="Pieddepage">
+  <w:style w:type="paragraph" w:styleId="Footer">
     <w:name w:val="footer"/>
     <w:basedOn w:val="Normal"/>
-    <w:link w:val="PieddepageCar"/>
+    <w:link w:val="FooterChar"/>
     <w:uiPriority w:val="99"/>
     <w:unhideWhenUsed/>
     <w:rsid w:val="00E618BF"/>
@@ -6307,14 +6304,14 @@
       <w:spacing w:after="0" w:line="240" w:lineRule="auto"/>
     </w:pPr>
   </w:style>
-  <w:style w:type="character" w:customStyle="1" w:styleId="PieddepageCar">
-    <w:name w:val="Pied de page Car"/>
-    <w:basedOn w:val="Policepardfaut"/>
-    <w:link w:val="Pieddepage"/>
+  <w:style w:type="character" w:customStyle="1" w:styleId="FooterChar">
+    <w:name w:val="Footer Char"/>
+    <w:basedOn w:val="DefaultParagraphFont"/>
+    <w:link w:val="Footer"/>
     <w:uiPriority w:val="99"/>
     <w:rsid w:val="00E618BF"/>
   </w:style>
-  <w:style w:type="paragraph" w:styleId="Sansinterligne">
+  <w:style w:type="paragraph" w:styleId="NoSpacing">
     <w:name w:val="No Spacing"/>
     <w:uiPriority w:val="1"/>
     <w:qFormat/>
@@ -6323,10 +6320,10 @@
       <w:spacing w:after="0" w:line="240" w:lineRule="auto"/>
     </w:pPr>
   </w:style>
-  <w:style w:type="character" w:customStyle="1" w:styleId="Titre1Car">
-    <w:name w:val="Titre 1 Car"/>
-    <w:basedOn w:val="Policepardfaut"/>
-    <w:link w:val="Titre1"/>
+  <w:style w:type="character" w:customStyle="1" w:styleId="Heading1Char">
+    <w:name w:val="Heading 1 Char"/>
+    <w:basedOn w:val="DefaultParagraphFont"/>
+    <w:link w:val="Heading1"/>
     <w:uiPriority w:val="9"/>
     <w:rsid w:val="00FC693F"/>
     <w:rPr>
@@ -6338,10 +6335,10 @@
       <w:szCs w:val="28"/>
     </w:rPr>
   </w:style>
-  <w:style w:type="character" w:customStyle="1" w:styleId="Titre2Car">
-    <w:name w:val="Titre 2 Car"/>
-    <w:basedOn w:val="Policepardfaut"/>
-    <w:link w:val="Titre2"/>
+  <w:style w:type="character" w:customStyle="1" w:styleId="Heading2Char">
+    <w:name w:val="Heading 2 Char"/>
+    <w:basedOn w:val="DefaultParagraphFont"/>
+    <w:link w:val="Heading2"/>
     <w:uiPriority w:val="9"/>
     <w:rsid w:val="00FC693F"/>
     <w:rPr>
@@ -6353,10 +6350,10 @@
       <w:szCs w:val="26"/>
     </w:rPr>
   </w:style>
-  <w:style w:type="character" w:customStyle="1" w:styleId="Titre3Car">
-    <w:name w:val="Titre 3 Car"/>
-    <w:basedOn w:val="Policepardfaut"/>
-    <w:link w:val="Titre3"/>
+  <w:style w:type="character" w:customStyle="1" w:styleId="Heading3Char">
+    <w:name w:val="Heading 3 Char"/>
+    <w:basedOn w:val="DefaultParagraphFont"/>
+    <w:link w:val="Heading3"/>
     <w:uiPriority w:val="9"/>
     <w:rsid w:val="00FC693F"/>
     <w:rPr>
@@ -6366,11 +6363,11 @@
       <w:color w:val="4F81BD" w:themeColor="accent1"/>
     </w:rPr>
   </w:style>
-  <w:style w:type="paragraph" w:styleId="Titre">
+  <w:style w:type="paragraph" w:styleId="Title">
     <w:name w:val="Title"/>
     <w:basedOn w:val="Normal"/>
     <w:next w:val="Normal"/>
-    <w:link w:val="TitreCar"/>
+    <w:link w:val="TitleChar"/>
     <w:uiPriority w:val="10"/>
     <w:qFormat/>
     <w:rsid w:val="00FC693F"/>
@@ -6390,10 +6387,10 @@
       <w:szCs w:val="52"/>
     </w:rPr>
   </w:style>
-  <w:style w:type="character" w:customStyle="1" w:styleId="TitreCar">
-    <w:name w:val="Titre Car"/>
-    <w:basedOn w:val="Policepardfaut"/>
-    <w:link w:val="Titre"/>
+  <w:style w:type="character" w:customStyle="1" w:styleId="TitleChar">
+    <w:name w:val="Title Char"/>
+    <w:basedOn w:val="DefaultParagraphFont"/>
+    <w:link w:val="Title"/>
     <w:uiPriority w:val="10"/>
     <w:rsid w:val="00FC693F"/>
     <w:rPr>
@@ -6405,11 +6402,11 @@
       <w:szCs w:val="52"/>
     </w:rPr>
   </w:style>
-  <w:style w:type="paragraph" w:styleId="Sous-titre">
+  <w:style w:type="paragraph" w:styleId="Subtitle">
     <w:name w:val="Subtitle"/>
     <w:basedOn w:val="Normal"/>
     <w:next w:val="Normal"/>
-    <w:link w:val="Sous-titreCar"/>
+    <w:link w:val="SubtitleChar"/>
     <w:uiPriority w:val="11"/>
     <w:qFormat/>
     <w:rsid w:val="00FC693F"/>
@@ -6427,10 +6424,10 @@
       <w:szCs w:val="24"/>
     </w:rPr>
   </w:style>
-  <w:style w:type="character" w:customStyle="1" w:styleId="Sous-titreCar">
-    <w:name w:val="Sous-titre Car"/>
-    <w:basedOn w:val="Policepardfaut"/>
-    <w:link w:val="Sous-titre"/>
+  <w:style w:type="character" w:customStyle="1" w:styleId="SubtitleChar">
+    <w:name w:val="Subtitle Char"/>
+    <w:basedOn w:val="DefaultParagraphFont"/>
+    <w:link w:val="Subtitle"/>
     <w:uiPriority w:val="11"/>
     <w:rsid w:val="00FC693F"/>
     <w:rPr>
@@ -6443,7 +6440,7 @@
       <w:szCs w:val="24"/>
     </w:rPr>
   </w:style>
-  <w:style w:type="paragraph" w:styleId="Paragraphedeliste">
+  <w:style w:type="paragraph" w:styleId="ListParagraph">
     <w:name w:val="List Paragraph"/>
     <w:basedOn w:val="Normal"/>
     <w:uiPriority w:val="34"/>
@@ -6454,10 +6451,10 @@
       <w:contextualSpacing/>
     </w:pPr>
   </w:style>
-  <w:style w:type="paragraph" w:styleId="Corpsdetexte">
+  <w:style w:type="paragraph" w:styleId="BodyText">
     <w:name w:val="Body Text"/>
     <w:basedOn w:val="Normal"/>
-    <w:link w:val="CorpsdetexteCar"/>
+    <w:link w:val="BodyTextChar"/>
     <w:uiPriority w:val="99"/>
     <w:unhideWhenUsed/>
     <w:rsid w:val="00AA1D8D"/>
@@ -6465,17 +6462,17 @@
       <w:spacing w:after="120"/>
     </w:pPr>
   </w:style>
-  <w:style w:type="character" w:customStyle="1" w:styleId="CorpsdetexteCar">
-    <w:name w:val="Corps de texte Car"/>
-    <w:basedOn w:val="Policepardfaut"/>
-    <w:link w:val="Corpsdetexte"/>
+  <w:style w:type="character" w:customStyle="1" w:styleId="BodyTextChar">
+    <w:name w:val="Body Text Char"/>
+    <w:basedOn w:val="DefaultParagraphFont"/>
+    <w:link w:val="BodyText"/>
     <w:uiPriority w:val="99"/>
     <w:rsid w:val="00AA1D8D"/>
   </w:style>
-  <w:style w:type="paragraph" w:styleId="Corpsdetexte2">
+  <w:style w:type="paragraph" w:styleId="BodyText2">
     <w:name w:val="Body Text 2"/>
     <w:basedOn w:val="Normal"/>
-    <w:link w:val="Corpsdetexte2Car"/>
+    <w:link w:val="BodyText2Char"/>
     <w:uiPriority w:val="99"/>
     <w:unhideWhenUsed/>
     <w:rsid w:val="00AA1D8D"/>
@@ -6483,17 +6480,17 @@
       <w:spacing w:after="120" w:line="480" w:lineRule="auto"/>
     </w:pPr>
   </w:style>
-  <w:style w:type="character" w:customStyle="1" w:styleId="Corpsdetexte2Car">
-    <w:name w:val="Corps de texte 2 Car"/>
-    <w:basedOn w:val="Policepardfaut"/>
-    <w:link w:val="Corpsdetexte2"/>
+  <w:style w:type="character" w:customStyle="1" w:styleId="BodyText2Char">
+    <w:name w:val="Body Text 2 Char"/>
+    <w:basedOn w:val="DefaultParagraphFont"/>
+    <w:link w:val="BodyText2"/>
     <w:uiPriority w:val="99"/>
     <w:rsid w:val="00AA1D8D"/>
   </w:style>
-  <w:style w:type="paragraph" w:styleId="Corpsdetexte3">
+  <w:style w:type="paragraph" w:styleId="BodyText3">
     <w:name w:val="Body Text 3"/>
     <w:basedOn w:val="Normal"/>
-    <w:link w:val="Corpsdetexte3Car"/>
+    <w:link w:val="BodyText3Char"/>
     <w:uiPriority w:val="99"/>
     <w:unhideWhenUsed/>
     <w:rsid w:val="00AA1D8D"/>
@@ -6505,10 +6502,10 @@
       <w:szCs w:val="16"/>
     </w:rPr>
   </w:style>
-  <w:style w:type="character" w:customStyle="1" w:styleId="Corpsdetexte3Car">
-    <w:name w:val="Corps de texte 3 Car"/>
-    <w:basedOn w:val="Policepardfaut"/>
-    <w:link w:val="Corpsdetexte3"/>
+  <w:style w:type="character" w:customStyle="1" w:styleId="BodyText3Char">
+    <w:name w:val="Body Text 3 Char"/>
+    <w:basedOn w:val="DefaultParagraphFont"/>
+    <w:link w:val="BodyText3"/>
     <w:uiPriority w:val="99"/>
     <w:rsid w:val="00AA1D8D"/>
     <w:rPr>
@@ -6516,7 +6513,7 @@
       <w:szCs w:val="16"/>
     </w:rPr>
   </w:style>
-  <w:style w:type="paragraph" w:styleId="Liste">
+  <w:style w:type="paragraph" w:styleId="List">
     <w:name w:val="List"/>
     <w:basedOn w:val="Normal"/>
     <w:uiPriority w:val="99"/>
@@ -6527,7 +6524,7 @@
       <w:contextualSpacing/>
     </w:pPr>
   </w:style>
-  <w:style w:type="paragraph" w:styleId="Liste2">
+  <w:style w:type="paragraph" w:styleId="List2">
     <w:name w:val="List 2"/>
     <w:basedOn w:val="Normal"/>
     <w:uiPriority w:val="99"/>
@@ -6538,7 +6535,7 @@
       <w:contextualSpacing/>
     </w:pPr>
   </w:style>
-  <w:style w:type="paragraph" w:styleId="Liste3">
+  <w:style w:type="paragraph" w:styleId="List3">
     <w:name w:val="List 3"/>
     <w:basedOn w:val="Normal"/>
     <w:uiPriority w:val="99"/>
@@ -6549,7 +6546,7 @@
       <w:contextualSpacing/>
     </w:pPr>
   </w:style>
-  <w:style w:type="paragraph" w:styleId="Listepuces">
+  <w:style w:type="paragraph" w:styleId="ListBullet">
     <w:name w:val="List Bullet"/>
     <w:basedOn w:val="Normal"/>
     <w:uiPriority w:val="99"/>
@@ -6562,7 +6559,7 @@
       <w:contextualSpacing/>
     </w:pPr>
   </w:style>
-  <w:style w:type="paragraph" w:styleId="Listepuces2">
+  <w:style w:type="paragraph" w:styleId="ListBullet2">
     <w:name w:val="List Bullet 2"/>
     <w:basedOn w:val="Normal"/>
     <w:uiPriority w:val="99"/>
@@ -6575,7 +6572,7 @@
       <w:contextualSpacing/>
     </w:pPr>
   </w:style>
-  <w:style w:type="paragraph" w:styleId="Listepuces3">
+  <w:style w:type="paragraph" w:styleId="ListBullet3">
     <w:name w:val="List Bullet 3"/>
     <w:basedOn w:val="Normal"/>
     <w:uiPriority w:val="99"/>
@@ -6588,7 +6585,7 @@
       <w:contextualSpacing/>
     </w:pPr>
   </w:style>
-  <w:style w:type="paragraph" w:styleId="Listenumros">
+  <w:style w:type="paragraph" w:styleId="ListNumber">
     <w:name w:val="List Number"/>
     <w:basedOn w:val="Normal"/>
     <w:uiPriority w:val="99"/>
@@ -6601,7 +6598,7 @@
       <w:contextualSpacing/>
     </w:pPr>
   </w:style>
-  <w:style w:type="paragraph" w:styleId="Listenumros2">
+  <w:style w:type="paragraph" w:styleId="ListNumber2">
     <w:name w:val="List Number 2"/>
     <w:basedOn w:val="Normal"/>
     <w:uiPriority w:val="99"/>
@@ -6614,7 +6611,7 @@
       <w:contextualSpacing/>
     </w:pPr>
   </w:style>
-  <w:style w:type="paragraph" w:styleId="Listenumros3">
+  <w:style w:type="paragraph" w:styleId="ListNumber3">
     <w:name w:val="List Number 3"/>
     <w:basedOn w:val="Normal"/>
     <w:uiPriority w:val="99"/>
@@ -6627,7 +6624,7 @@
       <w:contextualSpacing/>
     </w:pPr>
   </w:style>
-  <w:style w:type="paragraph" w:styleId="Listecontinue">
+  <w:style w:type="paragraph" w:styleId="ListContinue">
     <w:name w:val="List Continue"/>
     <w:basedOn w:val="Normal"/>
     <w:uiPriority w:val="99"/>
@@ -6639,7 +6636,7 @@
       <w:contextualSpacing/>
     </w:pPr>
   </w:style>
-  <w:style w:type="paragraph" w:styleId="Listecontinue2">
+  <w:style w:type="paragraph" w:styleId="ListContinue2">
     <w:name w:val="List Continue 2"/>
     <w:basedOn w:val="Normal"/>
     <w:uiPriority w:val="99"/>
@@ -6651,7 +6648,7 @@
       <w:contextualSpacing/>
     </w:pPr>
   </w:style>
-  <w:style w:type="paragraph" w:styleId="Listecontinue3">
+  <w:style w:type="paragraph" w:styleId="ListContinue3">
     <w:name w:val="List Continue 3"/>
     <w:basedOn w:val="Normal"/>
     <w:uiPriority w:val="99"/>
@@ -6663,9 +6660,9 @@
       <w:contextualSpacing/>
     </w:pPr>
   </w:style>
-  <w:style w:type="paragraph" w:styleId="Textedemacro">
+  <w:style w:type="paragraph" w:styleId="MacroText">
     <w:name w:val="macro"/>
-    <w:link w:val="TextedemacroCar"/>
+    <w:link w:val="MacroTextChar"/>
     <w:uiPriority w:val="99"/>
     <w:unhideWhenUsed/>
     <w:rsid w:val="0029639D"/>
@@ -6686,10 +6683,10 @@
       <w:szCs w:val="20"/>
     </w:rPr>
   </w:style>
-  <w:style w:type="character" w:customStyle="1" w:styleId="TextedemacroCar">
-    <w:name w:val="Texte de macro Car"/>
-    <w:basedOn w:val="Policepardfaut"/>
-    <w:link w:val="Textedemacro"/>
+  <w:style w:type="character" w:customStyle="1" w:styleId="MacroTextChar">
+    <w:name w:val="Macro Text Char"/>
+    <w:basedOn w:val="DefaultParagraphFont"/>
+    <w:link w:val="MacroText"/>
     <w:uiPriority w:val="99"/>
     <w:rsid w:val="0029639D"/>
     <w:rPr>
@@ -6698,11 +6695,11 @@
       <w:szCs w:val="20"/>
     </w:rPr>
   </w:style>
-  <w:style w:type="paragraph" w:styleId="Citation">
+  <w:style w:type="paragraph" w:styleId="Quote">
     <w:name w:val="Quote"/>
     <w:basedOn w:val="Normal"/>
     <w:next w:val="Normal"/>
-    <w:link w:val="CitationCar"/>
+    <w:link w:val="QuoteChar"/>
     <w:uiPriority w:val="29"/>
     <w:qFormat/>
     <w:rsid w:val="00FC693F"/>
@@ -6712,10 +6709,10 @@
       <w:color w:val="000000" w:themeColor="text1"/>
     </w:rPr>
   </w:style>
-  <w:style w:type="character" w:customStyle="1" w:styleId="CitationCar">
-    <w:name w:val="Citation Car"/>
-    <w:basedOn w:val="Policepardfaut"/>
-    <w:link w:val="Citation"/>
+  <w:style w:type="character" w:customStyle="1" w:styleId="QuoteChar">
+    <w:name w:val="Quote Char"/>
+    <w:basedOn w:val="DefaultParagraphFont"/>
+    <w:link w:val="Quote"/>
     <w:uiPriority w:val="29"/>
     <w:rsid w:val="00FC693F"/>
     <w:rPr>
@@ -6724,10 +6721,10 @@
       <w:color w:val="000000" w:themeColor="text1"/>
     </w:rPr>
   </w:style>
-  <w:style w:type="character" w:customStyle="1" w:styleId="Titre4Car">
-    <w:name w:val="Titre 4 Car"/>
-    <w:basedOn w:val="Policepardfaut"/>
-    <w:link w:val="Titre4"/>
+  <w:style w:type="character" w:customStyle="1" w:styleId="Heading4Char">
+    <w:name w:val="Heading 4 Char"/>
+    <w:basedOn w:val="DefaultParagraphFont"/>
+    <w:link w:val="Heading4"/>
     <w:uiPriority w:val="9"/>
     <w:semiHidden/>
     <w:rsid w:val="00FC693F"/>
@@ -6740,10 +6737,10 @@
       <w:color w:val="4F81BD" w:themeColor="accent1"/>
     </w:rPr>
   </w:style>
-  <w:style w:type="character" w:customStyle="1" w:styleId="Titre5Car">
-    <w:name w:val="Titre 5 Car"/>
-    <w:basedOn w:val="Policepardfaut"/>
-    <w:link w:val="Titre5"/>
+  <w:style w:type="character" w:customStyle="1" w:styleId="Heading5Char">
+    <w:name w:val="Heading 5 Char"/>
+    <w:basedOn w:val="DefaultParagraphFont"/>
+    <w:link w:val="Heading5"/>
     <w:uiPriority w:val="9"/>
     <w:semiHidden/>
     <w:rsid w:val="00FC693F"/>
@@ -6752,10 +6749,10 @@
       <w:color w:val="243F60" w:themeColor="accent1" w:themeShade="7F"/>
     </w:rPr>
   </w:style>
-  <w:style w:type="character" w:customStyle="1" w:styleId="Titre6Car">
-    <w:name w:val="Titre 6 Car"/>
-    <w:basedOn w:val="Policepardfaut"/>
-    <w:link w:val="Titre6"/>
+  <w:style w:type="character" w:customStyle="1" w:styleId="Heading6Char">
+    <w:name w:val="Heading 6 Char"/>
+    <w:basedOn w:val="DefaultParagraphFont"/>
+    <w:link w:val="Heading6"/>
     <w:uiPriority w:val="9"/>
     <w:semiHidden/>
     <w:rsid w:val="00FC693F"/>
@@ -6766,10 +6763,10 @@
       <w:color w:val="243F60" w:themeColor="accent1" w:themeShade="7F"/>
     </w:rPr>
   </w:style>
-  <w:style w:type="character" w:customStyle="1" w:styleId="Titre7Car">
-    <w:name w:val="Titre 7 Car"/>
-    <w:basedOn w:val="Policepardfaut"/>
-    <w:link w:val="Titre7"/>
+  <w:style w:type="character" w:customStyle="1" w:styleId="Heading7Char">
+    <w:name w:val="Heading 7 Char"/>
+    <w:basedOn w:val="DefaultParagraphFont"/>
+    <w:link w:val="Heading7"/>
     <w:uiPriority w:val="9"/>
     <w:semiHidden/>
     <w:rsid w:val="00FC693F"/>
@@ -6780,10 +6777,10 @@
       <w:color w:val="404040" w:themeColor="text1" w:themeTint="BF"/>
     </w:rPr>
   </w:style>
-  <w:style w:type="character" w:customStyle="1" w:styleId="Titre8Car">
-    <w:name w:val="Titre 8 Car"/>
-    <w:basedOn w:val="Policepardfaut"/>
-    <w:link w:val="Titre8"/>
+  <w:style w:type="character" w:customStyle="1" w:styleId="Heading8Char">
+    <w:name w:val="Heading 8 Char"/>
+    <w:basedOn w:val="DefaultParagraphFont"/>
+    <w:link w:val="Heading8"/>
     <w:uiPriority w:val="9"/>
     <w:semiHidden/>
     <w:rsid w:val="00FC693F"/>
@@ -6794,10 +6791,10 @@
       <w:szCs w:val="20"/>
     </w:rPr>
   </w:style>
-  <w:style w:type="character" w:customStyle="1" w:styleId="Titre9Car">
-    <w:name w:val="Titre 9 Car"/>
-    <w:basedOn w:val="Policepardfaut"/>
-    <w:link w:val="Titre9"/>
+  <w:style w:type="character" w:customStyle="1" w:styleId="Heading9Char">
+    <w:name w:val="Heading 9 Char"/>
+    <w:basedOn w:val="DefaultParagraphFont"/>
+    <w:link w:val="Heading9"/>
     <w:uiPriority w:val="9"/>
     <w:semiHidden/>
     <w:rsid w:val="00FC693F"/>
@@ -6810,7 +6807,7 @@
       <w:szCs w:val="20"/>
     </w:rPr>
   </w:style>
-  <w:style w:type="paragraph" w:styleId="Lgende">
+  <w:style w:type="paragraph" w:styleId="Caption">
     <w:name w:val="caption"/>
     <w:basedOn w:val="Normal"/>
     <w:next w:val="Normal"/>
@@ -6830,9 +6827,9 @@
       <w:szCs w:val="18"/>
     </w:rPr>
   </w:style>
-  <w:style w:type="character" w:styleId="lev">
+  <w:style w:type="character" w:styleId="Strong">
     <w:name w:val="Strong"/>
-    <w:basedOn w:val="Policepardfaut"/>
+    <w:basedOn w:val="DefaultParagraphFont"/>
     <w:uiPriority w:val="22"/>
     <w:qFormat/>
     <w:rsid w:val="00FC693F"/>
@@ -6841,9 +6838,9 @@
       <w:bCs/>
     </w:rPr>
   </w:style>
-  <w:style w:type="character" w:styleId="Accentuation">
+  <w:style w:type="character" w:styleId="Emphasis">
     <w:name w:val="Emphasis"/>
-    <w:basedOn w:val="Policepardfaut"/>
+    <w:basedOn w:val="DefaultParagraphFont"/>
     <w:uiPriority w:val="20"/>
     <w:qFormat/>
     <w:rsid w:val="00FC693F"/>
@@ -6852,11 +6849,11 @@
       <w:iCs/>
     </w:rPr>
   </w:style>
-  <w:style w:type="paragraph" w:styleId="Citationintense">
+  <w:style w:type="paragraph" w:styleId="IntenseQuote">
     <w:name w:val="Intense Quote"/>
     <w:basedOn w:val="Normal"/>
     <w:next w:val="Normal"/>
-    <w:link w:val="CitationintenseCar"/>
+    <w:link w:val="IntenseQuoteChar"/>
     <w:uiPriority w:val="30"/>
     <w:qFormat/>
     <w:rsid w:val="00FC693F"/>
@@ -6875,10 +6872,10 @@
       <w:color w:val="4F81BD" w:themeColor="accent1"/>
     </w:rPr>
   </w:style>
-  <w:style w:type="character" w:customStyle="1" w:styleId="CitationintenseCar">
-    <w:name w:val="Citation intense Car"/>
-    <w:basedOn w:val="Policepardfaut"/>
-    <w:link w:val="Citationintense"/>
+  <w:style w:type="character" w:customStyle="1" w:styleId="IntenseQuoteChar">
+    <w:name w:val="Intense Quote Char"/>
+    <w:basedOn w:val="DefaultParagraphFont"/>
+    <w:link w:val="IntenseQuote"/>
     <w:uiPriority w:val="30"/>
     <w:rsid w:val="00FC693F"/>
     <w:rPr>
@@ -6889,9 +6886,9 @@
       <w:color w:val="4F81BD" w:themeColor="accent1"/>
     </w:rPr>
   </w:style>
-  <w:style w:type="character" w:styleId="Accentuationlgre">
+  <w:style w:type="character" w:styleId="SubtleEmphasis">
     <w:name w:val="Subtle Emphasis"/>
-    <w:basedOn w:val="Policepardfaut"/>
+    <w:basedOn w:val="DefaultParagraphFont"/>
     <w:uiPriority w:val="19"/>
     <w:qFormat/>
     <w:rsid w:val="00FC693F"/>
@@ -6901,9 +6898,9 @@
       <w:color w:val="808080" w:themeColor="text1" w:themeTint="7F"/>
     </w:rPr>
   </w:style>
-  <w:style w:type="character" w:styleId="Accentuationintense">
+  <w:style w:type="character" w:styleId="IntenseEmphasis">
     <w:name w:val="Intense Emphasis"/>
-    <w:basedOn w:val="Policepardfaut"/>
+    <w:basedOn w:val="DefaultParagraphFont"/>
     <w:uiPriority w:val="21"/>
     <w:qFormat/>
     <w:rsid w:val="00FC693F"/>
@@ -6915,9 +6912,9 @@
       <w:color w:val="4F81BD" w:themeColor="accent1"/>
     </w:rPr>
   </w:style>
-  <w:style w:type="character" w:styleId="Rfrencelgre">
+  <w:style w:type="character" w:styleId="SubtleReference">
     <w:name w:val="Subtle Reference"/>
-    <w:basedOn w:val="Policepardfaut"/>
+    <w:basedOn w:val="DefaultParagraphFont"/>
     <w:uiPriority w:val="31"/>
     <w:qFormat/>
     <w:rsid w:val="00FC693F"/>
@@ -6927,9 +6924,9 @@
       <w:u w:val="single"/>
     </w:rPr>
   </w:style>
-  <w:style w:type="character" w:styleId="Rfrenceintense">
+  <w:style w:type="character" w:styleId="IntenseReference">
     <w:name w:val="Intense Reference"/>
-    <w:basedOn w:val="Policepardfaut"/>
+    <w:basedOn w:val="DefaultParagraphFont"/>
     <w:uiPriority w:val="32"/>
     <w:qFormat/>
     <w:rsid w:val="00FC693F"/>
@@ -6942,9 +6939,9 @@
       <w:u w:val="single"/>
     </w:rPr>
   </w:style>
-  <w:style w:type="character" w:styleId="Titredulivre">
+  <w:style w:type="character" w:styleId="BookTitle">
     <w:name w:val="Book Title"/>
-    <w:basedOn w:val="Policepardfaut"/>
+    <w:basedOn w:val="DefaultParagraphFont"/>
     <w:uiPriority w:val="33"/>
     <w:qFormat/>
     <w:rsid w:val="00FC693F"/>
@@ -6955,9 +6952,9 @@
       <w:spacing w:val="5"/>
     </w:rPr>
   </w:style>
-  <w:style w:type="paragraph" w:styleId="En-ttedetabledesmatires">
+  <w:style w:type="paragraph" w:styleId="TOCHeading">
     <w:name w:val="TOC Heading"/>
-    <w:basedOn w:val="Titre1"/>
+    <w:basedOn w:val="Heading1"/>
     <w:next w:val="Normal"/>
     <w:uiPriority w:val="39"/>
     <w:semiHidden/>
@@ -6968,9 +6965,9 @@
       <w:outlineLvl w:val="9"/>
     </w:pPr>
   </w:style>
-  <w:style w:type="table" w:styleId="Grilledutableau">
+  <w:style w:type="table" w:styleId="TableGrid">
     <w:name w:val="Table Grid"/>
-    <w:basedOn w:val="TableauNormal"/>
+    <w:basedOn w:val="TableNormal"/>
     <w:uiPriority w:val="59"/>
     <w:rsid w:val="00FC693F"/>
     <w:pPr>
@@ -6987,9 +6984,9 @@
       </w:tblBorders>
     </w:tblPr>
   </w:style>
-  <w:style w:type="table" w:styleId="Ombrageclair">
+  <w:style w:type="table" w:styleId="LightShading">
     <w:name w:val="Light Shading"/>
-    <w:basedOn w:val="TableauNormal"/>
+    <w:basedOn w:val="TableNormal"/>
     <w:uiPriority w:val="60"/>
     <w:rsid w:val="00FC693F"/>
     <w:pPr>
@@ -7083,9 +7080,9 @@
       </w:tcPr>
     </w:tblStylePr>
   </w:style>
-  <w:style w:type="table" w:styleId="Trameclaire-Accent1">
+  <w:style w:type="table" w:styleId="LightShading-Accent1">
     <w:name w:val="Light Shading Accent 1"/>
-    <w:basedOn w:val="TableauNormal"/>
+    <w:basedOn w:val="TableNormal"/>
     <w:uiPriority w:val="60"/>
     <w:rsid w:val="00FC693F"/>
     <w:pPr>
@@ -7179,9 +7176,9 @@
       </w:tcPr>
     </w:tblStylePr>
   </w:style>
-  <w:style w:type="table" w:styleId="Trameclaire-Accent2">
+  <w:style w:type="table" w:styleId="LightShading-Accent2">
     <w:name w:val="Light Shading Accent 2"/>
-    <w:basedOn w:val="TableauNormal"/>
+    <w:basedOn w:val="TableNormal"/>
     <w:uiPriority w:val="60"/>
     <w:rsid w:val="00FC693F"/>
     <w:pPr>
@@ -7275,9 +7272,9 @@
       </w:tcPr>
     </w:tblStylePr>
   </w:style>
-  <w:style w:type="table" w:styleId="Trameclaire-Accent3">
+  <w:style w:type="table" w:styleId="LightShading-Accent3">
     <w:name w:val="Light Shading Accent 3"/>
-    <w:basedOn w:val="TableauNormal"/>
+    <w:basedOn w:val="TableNormal"/>
     <w:uiPriority w:val="60"/>
     <w:rsid w:val="00FC693F"/>
     <w:pPr>
@@ -7371,9 +7368,9 @@
       </w:tcPr>
     </w:tblStylePr>
   </w:style>
-  <w:style w:type="table" w:styleId="Trameclaire-Accent4">
+  <w:style w:type="table" w:styleId="LightShading-Accent4">
     <w:name w:val="Light Shading Accent 4"/>
-    <w:basedOn w:val="TableauNormal"/>
+    <w:basedOn w:val="TableNormal"/>
     <w:uiPriority w:val="60"/>
     <w:rsid w:val="00FC693F"/>
     <w:pPr>
@@ -7467,9 +7464,9 @@
       </w:tcPr>
     </w:tblStylePr>
   </w:style>
-  <w:style w:type="table" w:styleId="Trameclaire-Accent5">
+  <w:style w:type="table" w:styleId="LightShading-Accent5">
     <w:name w:val="Light Shading Accent 5"/>
-    <w:basedOn w:val="TableauNormal"/>
+    <w:basedOn w:val="TableNormal"/>
     <w:uiPriority w:val="60"/>
     <w:rsid w:val="00FC693F"/>
     <w:pPr>
@@ -7563,9 +7560,9 @@
       </w:tcPr>
     </w:tblStylePr>
   </w:style>
-  <w:style w:type="table" w:styleId="Trameclaire-Accent6">
+  <w:style w:type="table" w:styleId="LightShading-Accent6">
     <w:name w:val="Light Shading Accent 6"/>
-    <w:basedOn w:val="TableauNormal"/>
+    <w:basedOn w:val="TableNormal"/>
     <w:uiPriority w:val="60"/>
     <w:rsid w:val="00FC693F"/>
     <w:pPr>
@@ -7659,9 +7656,9 @@
       </w:tcPr>
     </w:tblStylePr>
   </w:style>
-  <w:style w:type="table" w:styleId="Listeclaire">
+  <w:style w:type="table" w:styleId="LightList">
     <w:name w:val="Light List"/>
-    <w:basedOn w:val="TableauNormal"/>
+    <w:basedOn w:val="TableNormal"/>
     <w:uiPriority w:val="61"/>
     <w:rsid w:val="00FC693F"/>
     <w:pPr>
@@ -7744,9 +7741,9 @@
       </w:tcPr>
     </w:tblStylePr>
   </w:style>
-  <w:style w:type="table" w:styleId="Listeclaire-Accent1">
+  <w:style w:type="table" w:styleId="LightList-Accent1">
     <w:name w:val="Light List Accent 1"/>
-    <w:basedOn w:val="TableauNormal"/>
+    <w:basedOn w:val="TableNormal"/>
     <w:uiPriority w:val="61"/>
     <w:rsid w:val="00FC693F"/>
     <w:pPr>
@@ -7829,9 +7826,9 @@
       </w:tcPr>
     </w:tblStylePr>
   </w:style>
-  <w:style w:type="table" w:styleId="Listeclaire-Accent2">
+  <w:style w:type="table" w:styleId="LightList-Accent2">
     <w:name w:val="Light List Accent 2"/>
-    <w:basedOn w:val="TableauNormal"/>
+    <w:basedOn w:val="TableNormal"/>
     <w:uiPriority w:val="61"/>
     <w:rsid w:val="00CB0664"/>
     <w:pPr>
@@ -7914,9 +7911,9 @@
       </w:tcPr>
     </w:tblStylePr>
   </w:style>
-  <w:style w:type="table" w:styleId="Listeclaire-Accent3">
+  <w:style w:type="table" w:styleId="LightList-Accent3">
     <w:name w:val="Light List Accent 3"/>
-    <w:basedOn w:val="TableauNormal"/>
+    <w:basedOn w:val="TableNormal"/>
     <w:uiPriority w:val="61"/>
     <w:rsid w:val="00CB0664"/>
     <w:pPr>
@@ -7999,9 +7996,9 @@
       </w:tcPr>
     </w:tblStylePr>
   </w:style>
-  <w:style w:type="table" w:styleId="Listeclaire-Accent4">
+  <w:style w:type="table" w:styleId="LightList-Accent4">
     <w:name w:val="Light List Accent 4"/>
-    <w:basedOn w:val="TableauNormal"/>
+    <w:basedOn w:val="TableNormal"/>
     <w:uiPriority w:val="61"/>
     <w:rsid w:val="00CB0664"/>
     <w:pPr>
@@ -8084,9 +8081,9 @@
       </w:tcPr>
     </w:tblStylePr>
   </w:style>
-  <w:style w:type="table" w:styleId="Listeclaire-Accent5">
+  <w:style w:type="table" w:styleId="LightList-Accent5">
     <w:name w:val="Light List Accent 5"/>
-    <w:basedOn w:val="TableauNormal"/>
+    <w:basedOn w:val="TableNormal"/>
     <w:uiPriority w:val="61"/>
     <w:rsid w:val="00CB0664"/>
     <w:pPr>
@@ -8169,9 +8166,9 @@
       </w:tcPr>
     </w:tblStylePr>
   </w:style>
-  <w:style w:type="table" w:styleId="Listeclaire-Accent6">
+  <w:style w:type="table" w:styleId="LightList-Accent6">
     <w:name w:val="Light List Accent 6"/>
-    <w:basedOn w:val="TableauNormal"/>
+    <w:basedOn w:val="TableNormal"/>
     <w:uiPriority w:val="61"/>
     <w:rsid w:val="00CB0664"/>
     <w:pPr>
@@ -8254,9 +8251,9 @@
       </w:tcPr>
     </w:tblStylePr>
   </w:style>
-  <w:style w:type="table" w:styleId="Grilleclaire">
+  <w:style w:type="table" w:styleId="LightGrid">
     <w:name w:val="Light Grid"/>
-    <w:basedOn w:val="TableauNormal"/>
+    <w:basedOn w:val="TableNormal"/>
     <w:uiPriority w:val="62"/>
     <w:rsid w:val="00CB0664"/>
     <w:pPr>
@@ -8377,9 +8374,9 @@
       </w:tcPr>
     </w:tblStylePr>
   </w:style>
-  <w:style w:type="table" w:styleId="Grilleclaire-Accent1">
+  <w:style w:type="table" w:styleId="LightGrid-Accent1">
     <w:name w:val="Light Grid Accent 1"/>
-    <w:basedOn w:val="TableauNormal"/>
+    <w:basedOn w:val="TableNormal"/>
     <w:uiPriority w:val="62"/>
     <w:rsid w:val="00CB0664"/>
     <w:pPr>
@@ -8500,9 +8497,9 @@
       </w:tcPr>
     </w:tblStylePr>
   </w:style>
-  <w:style w:type="table" w:styleId="Grilleclaire-Accent2">
+  <w:style w:type="table" w:styleId="LightGrid-Accent2">
     <w:name w:val="Light Grid Accent 2"/>
-    <w:basedOn w:val="TableauNormal"/>
+    <w:basedOn w:val="TableNormal"/>
     <w:uiPriority w:val="62"/>
     <w:rsid w:val="00CB0664"/>
     <w:pPr>
@@ -8623,9 +8620,9 @@
       </w:tcPr>
     </w:tblStylePr>
   </w:style>
-  <w:style w:type="table" w:styleId="Grilleclaire-Accent3">
+  <w:style w:type="table" w:styleId="LightGrid-Accent3">
     <w:name w:val="Light Grid Accent 3"/>
-    <w:basedOn w:val="TableauNormal"/>
+    <w:basedOn w:val="TableNormal"/>
     <w:uiPriority w:val="62"/>
     <w:rsid w:val="00CB0664"/>
     <w:pPr>
@@ -8746,9 +8743,9 @@
       </w:tcPr>
     </w:tblStylePr>
   </w:style>
-  <w:style w:type="table" w:styleId="Grilleclaire-Accent4">
+  <w:style w:type="table" w:styleId="LightGrid-Accent4">
     <w:name w:val="Light Grid Accent 4"/>
-    <w:basedOn w:val="TableauNormal"/>
+    <w:basedOn w:val="TableNormal"/>
     <w:uiPriority w:val="62"/>
     <w:rsid w:val="00CB0664"/>
     <w:pPr>
@@ -8869,9 +8866,9 @@
       </w:tcPr>
     </w:tblStylePr>
   </w:style>
-  <w:style w:type="table" w:styleId="Grilleclaire-Accent5">
+  <w:style w:type="table" w:styleId="LightGrid-Accent5">
     <w:name w:val="Light Grid Accent 5"/>
-    <w:basedOn w:val="TableauNormal"/>
+    <w:basedOn w:val="TableNormal"/>
     <w:uiPriority w:val="62"/>
     <w:rsid w:val="00CB0664"/>
     <w:pPr>
@@ -8992,9 +8989,9 @@
       </w:tcPr>
     </w:tblStylePr>
   </w:style>
-  <w:style w:type="table" w:styleId="Grilleclaire-Accent6">
+  <w:style w:type="table" w:styleId="LightGrid-Accent6">
     <w:name w:val="Light Grid Accent 6"/>
-    <w:basedOn w:val="TableauNormal"/>
+    <w:basedOn w:val="TableNormal"/>
     <w:uiPriority w:val="62"/>
     <w:rsid w:val="00CB0664"/>
     <w:pPr>
@@ -9115,9 +9112,9 @@
       </w:tcPr>
     </w:tblStylePr>
   </w:style>
-  <w:style w:type="table" w:styleId="Tramemoyenne1">
+  <w:style w:type="table" w:styleId="MediumShading1">
     <w:name w:val="Medium Shading 1"/>
-    <w:basedOn w:val="TableauNormal"/>
+    <w:basedOn w:val="TableNormal"/>
     <w:uiPriority w:val="63"/>
     <w:rsid w:val="00CB0664"/>
     <w:pPr>
@@ -9214,9 +9211,9 @@
       </w:tcPr>
     </w:tblStylePr>
   </w:style>
-  <w:style w:type="table" w:styleId="Tramemoyenne1-Accent1">
+  <w:style w:type="table" w:styleId="MediumShading1-Accent1">
     <w:name w:val="Medium Shading 1 Accent 1"/>
-    <w:basedOn w:val="TableauNormal"/>
+    <w:basedOn w:val="TableNormal"/>
     <w:uiPriority w:val="63"/>
     <w:rsid w:val="00CB0664"/>
     <w:pPr>
@@ -9313,9 +9310,9 @@
       </w:tcPr>
     </w:tblStylePr>
   </w:style>
-  <w:style w:type="table" w:styleId="Tramemoyenne1-Accent2">
+  <w:style w:type="table" w:styleId="MediumShading1-Accent2">
     <w:name w:val="Medium Shading 1 Accent 2"/>
-    <w:basedOn w:val="TableauNormal"/>
+    <w:basedOn w:val="TableNormal"/>
     <w:uiPriority w:val="63"/>
     <w:rsid w:val="00CB0664"/>
     <w:pPr>
@@ -9412,9 +9409,9 @@
       </w:tcPr>
     </w:tblStylePr>
   </w:style>
-  <w:style w:type="table" w:styleId="Tramemoyenne1-Accent3">
+  <w:style w:type="table" w:styleId="MediumShading1-Accent3">
     <w:name w:val="Medium Shading 1 Accent 3"/>
-    <w:basedOn w:val="TableauNormal"/>
+    <w:basedOn w:val="TableNormal"/>
     <w:uiPriority w:val="63"/>
     <w:rsid w:val="00CB0664"/>
     <w:pPr>
@@ -9511,9 +9508,9 @@
       </w:tcPr>
     </w:tblStylePr>
   </w:style>
-  <w:style w:type="table" w:styleId="Tramemoyenne1-Accent4">
+  <w:style w:type="table" w:styleId="MediumShading1-Accent4">
     <w:name w:val="Medium Shading 1 Accent 4"/>
-    <w:basedOn w:val="TableauNormal"/>
+    <w:basedOn w:val="TableNormal"/>
     <w:uiPriority w:val="63"/>
     <w:rsid w:val="00CB0664"/>
     <w:pPr>
@@ -9610,9 +9607,9 @@
       </w:tcPr>
     </w:tblStylePr>
   </w:style>
-  <w:style w:type="table" w:styleId="Tramemoyenne1-Accent5">
+  <w:style w:type="table" w:styleId="MediumShading1-Accent5">
     <w:name w:val="Medium Shading 1 Accent 5"/>
-    <w:basedOn w:val="TableauNormal"/>
+    <w:basedOn w:val="TableNormal"/>
     <w:uiPriority w:val="63"/>
     <w:rsid w:val="00CB0664"/>
     <w:pPr>
@@ -9709,9 +9706,9 @@
       </w:tcPr>
     </w:tblStylePr>
   </w:style>
-  <w:style w:type="table" w:styleId="Tramemoyenne1-Accent6">
+  <w:style w:type="table" w:styleId="MediumShading1-Accent6">
     <w:name w:val="Medium Shading 1 Accent 6"/>
-    <w:basedOn w:val="TableauNormal"/>
+    <w:basedOn w:val="TableNormal"/>
     <w:uiPriority w:val="63"/>
     <w:rsid w:val="00CB0664"/>
     <w:pPr>
@@ -9808,9 +9805,9 @@
       </w:tcPr>
     </w:tblStylePr>
   </w:style>
-  <w:style w:type="table" w:styleId="Tramemoyenne2">
+  <w:style w:type="table" w:styleId="MediumShading2">
     <w:name w:val="Medium Shading 2"/>
-    <w:basedOn w:val="TableauNormal"/>
+    <w:basedOn w:val="TableNormal"/>
     <w:uiPriority w:val="64"/>
     <w:rsid w:val="00CB0664"/>
     <w:pPr>
@@ -9950,9 +9947,9 @@
       </w:tcPr>
     </w:tblStylePr>
   </w:style>
-  <w:style w:type="table" w:styleId="Tramemoyenne2-Accent1">
+  <w:style w:type="table" w:styleId="MediumShading2-Accent1">
     <w:name w:val="Medium Shading 2 Accent 1"/>
-    <w:basedOn w:val="TableauNormal"/>
+    <w:basedOn w:val="TableNormal"/>
     <w:uiPriority w:val="64"/>
     <w:rsid w:val="00CB0664"/>
     <w:pPr>
@@ -10092,9 +10089,9 @@
       </w:tcPr>
     </w:tblStylePr>
   </w:style>
-  <w:style w:type="table" w:styleId="Tramemoyenne2-Accent2">
+  <w:style w:type="table" w:styleId="MediumShading2-Accent2">
     <w:name w:val="Medium Shading 2 Accent 2"/>
-    <w:basedOn w:val="TableauNormal"/>
+    <w:basedOn w:val="TableNormal"/>
     <w:uiPriority w:val="64"/>
     <w:rsid w:val="00CB0664"/>
     <w:pPr>
@@ -10234,9 +10231,9 @@
       </w:tcPr>
     </w:tblStylePr>
   </w:style>
-  <w:style w:type="table" w:styleId="Tramemoyenne2-Accent3">
+  <w:style w:type="table" w:styleId="MediumShading2-Accent3">
     <w:name w:val="Medium Shading 2 Accent 3"/>
-    <w:basedOn w:val="TableauNormal"/>
+    <w:basedOn w:val="TableNormal"/>
     <w:uiPriority w:val="64"/>
     <w:rsid w:val="00CB0664"/>
     <w:pPr>
@@ -10376,9 +10373,9 @@
       </w:tcPr>
     </w:tblStylePr>
   </w:style>
-  <w:style w:type="table" w:styleId="Tramemoyenne2-Accent4">
+  <w:style w:type="table" w:styleId="MediumShading2-Accent4">
     <w:name w:val="Medium Shading 2 Accent 4"/>
-    <w:basedOn w:val="TableauNormal"/>
+    <w:basedOn w:val="TableNormal"/>
     <w:uiPriority w:val="64"/>
     <w:rsid w:val="00CB0664"/>
     <w:pPr>
@@ -10518,9 +10515,9 @@
       </w:tcPr>
     </w:tblStylePr>
   </w:style>
-  <w:style w:type="table" w:styleId="Tramemoyenne2-Accent5">
+  <w:style w:type="table" w:styleId="MediumShading2-Accent5">
     <w:name w:val="Medium Shading 2 Accent 5"/>
-    <w:basedOn w:val="TableauNormal"/>
+    <w:basedOn w:val="TableNormal"/>
     <w:uiPriority w:val="64"/>
     <w:rsid w:val="00CB0664"/>
     <w:pPr>
@@ -10660,9 +10657,9 @@
       </w:tcPr>
     </w:tblStylePr>
   </w:style>
-  <w:style w:type="table" w:styleId="Tramemoyenne2-Accent6">
+  <w:style w:type="table" w:styleId="MediumShading2-Accent6">
     <w:name w:val="Medium Shading 2 Accent 6"/>
-    <w:basedOn w:val="TableauNormal"/>
+    <w:basedOn w:val="TableNormal"/>
     <w:uiPriority w:val="64"/>
     <w:rsid w:val="00CB0664"/>
     <w:pPr>
@@ -10802,9 +10799,9 @@
       </w:tcPr>
     </w:tblStylePr>
   </w:style>
-  <w:style w:type="table" w:styleId="Listemoyenne1">
+  <w:style w:type="table" w:styleId="MediumList1">
     <w:name w:val="Medium List 1"/>
-    <w:basedOn w:val="TableauNormal"/>
+    <w:basedOn w:val="TableNormal"/>
     <w:uiPriority w:val="65"/>
     <w:rsid w:val="00CB0664"/>
     <w:pPr>
@@ -10879,9 +10876,9 @@
       </w:tcPr>
     </w:tblStylePr>
   </w:style>
-  <w:style w:type="table" w:styleId="Listemoyenne1-Accent1">
+  <w:style w:type="table" w:styleId="MediumList1-Accent1">
     <w:name w:val="Medium List 1 Accent 1"/>
-    <w:basedOn w:val="TableauNormal"/>
+    <w:basedOn w:val="TableNormal"/>
     <w:uiPriority w:val="65"/>
     <w:rsid w:val="00CB0664"/>
     <w:pPr>
@@ -10956,9 +10953,9 @@
       </w:tcPr>
     </w:tblStylePr>
   </w:style>
-  <w:style w:type="table" w:styleId="Listemoyenne1-Accent2">
+  <w:style w:type="table" w:styleId="MediumList1-Accent2">
     <w:name w:val="Medium List 1 Accent 2"/>
-    <w:basedOn w:val="TableauNormal"/>
+    <w:basedOn w:val="TableNormal"/>
     <w:uiPriority w:val="65"/>
     <w:rsid w:val="00CB0664"/>
     <w:pPr>
@@ -11033,9 +11030,9 @@
       </w:tcPr>
     </w:tblStylePr>
   </w:style>
-  <w:style w:type="table" w:styleId="Listemoyenne1-Accent3">
+  <w:style w:type="table" w:styleId="MediumList1-Accent3">
     <w:name w:val="Medium List 1 Accent 3"/>
-    <w:basedOn w:val="TableauNormal"/>
+    <w:basedOn w:val="TableNormal"/>
     <w:uiPriority w:val="65"/>
     <w:rsid w:val="00CB0664"/>
     <w:pPr>
@@ -11110,9 +11107,9 @@
       </w:tcPr>
     </w:tblStylePr>
   </w:style>
-  <w:style w:type="table" w:styleId="Listemoyenne1-Accent4">
+  <w:style w:type="table" w:styleId="MediumList1-Accent4">
     <w:name w:val="Medium List 1 Accent 4"/>
-    <w:basedOn w:val="TableauNormal"/>
+    <w:basedOn w:val="TableNormal"/>
     <w:uiPriority w:val="65"/>
     <w:rsid w:val="00CB0664"/>
     <w:pPr>
@@ -11187,9 +11184,9 @@
       </w:tcPr>
     </w:tblStylePr>
   </w:style>
-  <w:style w:type="table" w:styleId="Listemoyenne1-Accent5">
+  <w:style w:type="table" w:styleId="MediumList1-Accent5">
     <w:name w:val="Medium List 1 Accent 5"/>
-    <w:basedOn w:val="TableauNormal"/>
+    <w:basedOn w:val="TableNormal"/>
     <w:uiPriority w:val="65"/>
     <w:rsid w:val="00CB0664"/>
     <w:pPr>
@@ -11264,9 +11261,9 @@
       </w:tcPr>
     </w:tblStylePr>
   </w:style>
-  <w:style w:type="table" w:styleId="Listemoyenne1-Accent6">
+  <w:style w:type="table" w:styleId="MediumList1-Accent6">
     <w:name w:val="Medium List 1 Accent 6"/>
-    <w:basedOn w:val="TableauNormal"/>
+    <w:basedOn w:val="TableNormal"/>
     <w:uiPriority w:val="65"/>
     <w:rsid w:val="00CB0664"/>
     <w:pPr>
@@ -11341,9 +11338,9 @@
       </w:tcPr>
     </w:tblStylePr>
   </w:style>
-  <w:style w:type="table" w:styleId="Listemoyenne2">
+  <w:style w:type="table" w:styleId="MediumList2">
     <w:name w:val="Medium List 2"/>
-    <w:basedOn w:val="TableauNormal"/>
+    <w:basedOn w:val="TableNormal"/>
     <w:uiPriority w:val="66"/>
     <w:rsid w:val="00CB0664"/>
     <w:pPr>
@@ -11462,9 +11459,9 @@
       </w:tcPr>
     </w:tblStylePr>
   </w:style>
-  <w:style w:type="table" w:styleId="Listemoyenne2-Accent1">
+  <w:style w:type="table" w:styleId="MediumList2-Accent1">
     <w:name w:val="Medium List 2 Accent 1"/>
-    <w:basedOn w:val="TableauNormal"/>
+    <w:basedOn w:val="TableNormal"/>
     <w:uiPriority w:val="66"/>
     <w:rsid w:val="00CB0664"/>
     <w:pPr>
@@ -11583,9 +11580,9 @@
       </w:tcPr>
     </w:tblStylePr>
   </w:style>
-  <w:style w:type="table" w:styleId="Listemoyenne2-Accent2">
+  <w:style w:type="table" w:styleId="MediumList2-Accent2">
     <w:name w:val="Medium List 2 Accent 2"/>
-    <w:basedOn w:val="TableauNormal"/>
+    <w:basedOn w:val="TableNormal"/>
     <w:uiPriority w:val="66"/>
     <w:rsid w:val="00CB0664"/>
     <w:pPr>
@@ -11704,9 +11701,9 @@
       </w:tcPr>
     </w:tblStylePr>
   </w:style>
-  <w:style w:type="table" w:styleId="Listemoyenne2-Accent3">
+  <w:style w:type="table" w:styleId="MediumList2-Accent3">
     <w:name w:val="Medium List 2 Accent 3"/>
-    <w:basedOn w:val="TableauNormal"/>
+    <w:basedOn w:val="TableNormal"/>
     <w:uiPriority w:val="66"/>
     <w:rsid w:val="00CB0664"/>
     <w:pPr>
@@ -11825,9 +11822,9 @@
       </w:tcPr>
     </w:tblStylePr>
   </w:style>
-  <w:style w:type="table" w:styleId="Listemoyenne2-Accent4">
+  <w:style w:type="table" w:styleId="MediumList2-Accent4">
     <w:name w:val="Medium List 2 Accent 4"/>
-    <w:basedOn w:val="TableauNormal"/>
+    <w:basedOn w:val="TableNormal"/>
     <w:uiPriority w:val="66"/>
     <w:rsid w:val="00CB0664"/>
     <w:pPr>
@@ -11946,9 +11943,9 @@
       </w:tcPr>
     </w:tblStylePr>
   </w:style>
-  <w:style w:type="table" w:styleId="Listemoyenne2-Accent5">
+  <w:style w:type="table" w:styleId="MediumList2-Accent5">
     <w:name w:val="Medium List 2 Accent 5"/>
-    <w:basedOn w:val="TableauNormal"/>
+    <w:basedOn w:val="TableNormal"/>
     <w:uiPriority w:val="66"/>
     <w:rsid w:val="00CB0664"/>
     <w:pPr>
@@ -12067,9 +12064,9 @@
       </w:tcPr>
     </w:tblStylePr>
   </w:style>
-  <w:style w:type="table" w:styleId="Listemoyenne2-Accent6">
+  <w:style w:type="table" w:styleId="MediumList2-Accent6">
     <w:name w:val="Medium List 2 Accent 6"/>
-    <w:basedOn w:val="TableauNormal"/>
+    <w:basedOn w:val="TableNormal"/>
     <w:uiPriority w:val="66"/>
     <w:rsid w:val="00CB0664"/>
     <w:pPr>
@@ -12188,9 +12185,9 @@
       </w:tcPr>
     </w:tblStylePr>
   </w:style>
-  <w:style w:type="table" w:styleId="Grillemoyenne1">
+  <w:style w:type="table" w:styleId="MediumGrid1">
     <w:name w:val="Medium Grid 1"/>
-    <w:basedOn w:val="TableauNormal"/>
+    <w:basedOn w:val="TableNormal"/>
     <w:uiPriority w:val="67"/>
     <w:rsid w:val="00CB0664"/>
     <w:pPr>
@@ -12254,9 +12251,9 @@
       </w:tcPr>
     </w:tblStylePr>
   </w:style>
-  <w:style w:type="table" w:styleId="Grillemoyenne1-Accent1">
+  <w:style w:type="table" w:styleId="MediumGrid1-Accent1">
     <w:name w:val="Medium Grid 1 Accent 1"/>
-    <w:basedOn w:val="TableauNormal"/>
+    <w:basedOn w:val="TableNormal"/>
     <w:uiPriority w:val="67"/>
     <w:rsid w:val="00CB0664"/>
     <w:pPr>
@@ -12320,9 +12317,9 @@
       </w:tcPr>
     </w:tblStylePr>
   </w:style>
-  <w:style w:type="table" w:styleId="Grillemoyenne1-Accent2">
+  <w:style w:type="table" w:styleId="MediumGrid1-Accent2">
     <w:name w:val="Medium Grid 1 Accent 2"/>
-    <w:basedOn w:val="TableauNormal"/>
+    <w:basedOn w:val="TableNormal"/>
     <w:uiPriority w:val="67"/>
     <w:rsid w:val="00CB0664"/>
     <w:pPr>
@@ -12386,9 +12383,9 @@
       </w:tcPr>
     </w:tblStylePr>
   </w:style>
-  <w:style w:type="table" w:styleId="Grillemoyenne1-Accent3">
+  <w:style w:type="table" w:styleId="MediumGrid1-Accent3">
     <w:name w:val="Medium Grid 1 Accent 3"/>
-    <w:basedOn w:val="TableauNormal"/>
+    <w:basedOn w:val="TableNormal"/>
     <w:uiPriority w:val="67"/>
     <w:rsid w:val="00CB0664"/>
     <w:pPr>
@@ -12452,9 +12449,9 @@
       </w:tcPr>
     </w:tblStylePr>
   </w:style>
-  <w:style w:type="table" w:styleId="Grillemoyenne1-Accent4">
+  <w:style w:type="table" w:styleId="MediumGrid1-Accent4">
     <w:name w:val="Medium Grid 1 Accent 4"/>
-    <w:basedOn w:val="TableauNormal"/>
+    <w:basedOn w:val="TableNormal"/>
     <w:uiPriority w:val="67"/>
     <w:rsid w:val="00CB0664"/>
     <w:pPr>
@@ -12518,9 +12515,9 @@
       </w:tcPr>
     </w:tblStylePr>
   </w:style>
-  <w:style w:type="table" w:styleId="Grillemoyenne1-Accent5">
+  <w:style w:type="table" w:styleId="MediumGrid1-Accent5">
     <w:name w:val="Medium Grid 1 Accent 5"/>
-    <w:basedOn w:val="TableauNormal"/>
+    <w:basedOn w:val="TableNormal"/>
     <w:uiPriority w:val="67"/>
     <w:rsid w:val="00CB0664"/>
     <w:pPr>
@@ -12584,9 +12581,9 @@
       </w:tcPr>
     </w:tblStylePr>
   </w:style>
-  <w:style w:type="table" w:styleId="Grillemoyenne1-Accent6">
+  <w:style w:type="table" w:styleId="MediumGrid1-Accent6">
     <w:name w:val="Medium Grid 1 Accent 6"/>
-    <w:basedOn w:val="TableauNormal"/>
+    <w:basedOn w:val="TableNormal"/>
     <w:uiPriority w:val="67"/>
     <w:rsid w:val="00CB0664"/>
     <w:pPr>
@@ -12650,9 +12647,9 @@
       </w:tcPr>
     </w:tblStylePr>
   </w:style>
-  <w:style w:type="table" w:styleId="Grillemoyenne2">
+  <w:style w:type="table" w:styleId="MediumGrid2">
     <w:name w:val="Medium Grid 2"/>
-    <w:basedOn w:val="TableauNormal"/>
+    <w:basedOn w:val="TableNormal"/>
     <w:uiPriority w:val="68"/>
     <w:rsid w:val="00CB0664"/>
     <w:pPr>
@@ -12768,9 +12765,9 @@
       </w:tcPr>
     </w:tblStylePr>
   </w:style>
-  <w:style w:type="table" w:styleId="Grillemoyenne2-Accent1">
+  <w:style w:type="table" w:styleId="MediumGrid2-Accent1">
     <w:name w:val="Medium Grid 2 Accent 1"/>
-    <w:basedOn w:val="TableauNormal"/>
+    <w:basedOn w:val="TableNormal"/>
     <w:uiPriority w:val="68"/>
     <w:rsid w:val="00CB0664"/>
     <w:pPr>
@@ -12886,9 +12883,9 @@
       </w:tcPr>
     </w:tblStylePr>
   </w:style>
-  <w:style w:type="table" w:styleId="Grillemoyenne2-Accent2">
+  <w:style w:type="table" w:styleId="MediumGrid2-Accent2">
     <w:name w:val="Medium Grid 2 Accent 2"/>
-    <w:basedOn w:val="TableauNormal"/>
+    <w:basedOn w:val="TableNormal"/>
     <w:uiPriority w:val="68"/>
     <w:rsid w:val="00CB0664"/>
     <w:pPr>
@@ -13004,9 +13001,9 @@
       </w:tcPr>
     </w:tblStylePr>
   </w:style>
-  <w:style w:type="table" w:styleId="Grillemoyenne2-Accent3">
+  <w:style w:type="table" w:styleId="MediumGrid2-Accent3">
     <w:name w:val="Medium Grid 2 Accent 3"/>
-    <w:basedOn w:val="TableauNormal"/>
+    <w:basedOn w:val="TableNormal"/>
     <w:uiPriority w:val="68"/>
     <w:rsid w:val="00CB0664"/>
     <w:pPr>
@@ -13122,9 +13119,9 @@
       </w:tcPr>
     </w:tblStylePr>
   </w:style>
-  <w:style w:type="table" w:styleId="Grillemoyenne2-Accent4">
+  <w:style w:type="table" w:styleId="MediumGrid2-Accent4">
     <w:name w:val="Medium Grid 2 Accent 4"/>
-    <w:basedOn w:val="TableauNormal"/>
+    <w:basedOn w:val="TableNormal"/>
     <w:uiPriority w:val="68"/>
     <w:rsid w:val="00CB0664"/>
     <w:pPr>
@@ -13240,9 +13237,9 @@
       </w:tcPr>
     </w:tblStylePr>
   </w:style>
-  <w:style w:type="table" w:styleId="Grillemoyenne2-Accent5">
+  <w:style w:type="table" w:styleId="MediumGrid2-Accent5">
     <w:name w:val="Medium Grid 2 Accent 5"/>
-    <w:basedOn w:val="TableauNormal"/>
+    <w:basedOn w:val="TableNormal"/>
     <w:uiPriority w:val="68"/>
     <w:rsid w:val="00CB0664"/>
     <w:pPr>
@@ -13358,9 +13355,9 @@
       </w:tcPr>
     </w:tblStylePr>
   </w:style>
-  <w:style w:type="table" w:styleId="Grillemoyenne2-Accent6">
+  <w:style w:type="table" w:styleId="MediumGrid2-Accent6">
     <w:name w:val="Medium Grid 2 Accent 6"/>
-    <w:basedOn w:val="TableauNormal"/>
+    <w:basedOn w:val="TableNormal"/>
     <w:uiPriority w:val="68"/>
     <w:rsid w:val="00CB0664"/>
     <w:pPr>
@@ -13476,9 +13473,9 @@
       </w:tcPr>
     </w:tblStylePr>
   </w:style>
-  <w:style w:type="table" w:styleId="Grillemoyenne3">
+  <w:style w:type="table" w:styleId="MediumGrid3">
     <w:name w:val="Medium Grid 3"/>
-    <w:basedOn w:val="TableauNormal"/>
+    <w:basedOn w:val="TableNormal"/>
     <w:uiPriority w:val="69"/>
     <w:rsid w:val="00CB0664"/>
     <w:pPr>
@@ -13610,9 +13607,9 @@
       </w:tcPr>
     </w:tblStylePr>
   </w:style>
-  <w:style w:type="table" w:styleId="Grillemoyenne3-Accent1">
+  <w:style w:type="table" w:styleId="MediumGrid3-Accent1">
     <w:name w:val="Medium Grid 3 Accent 1"/>
-    <w:basedOn w:val="TableauNormal"/>
+    <w:basedOn w:val="TableNormal"/>
     <w:uiPriority w:val="69"/>
     <w:rsid w:val="00CB0664"/>
     <w:pPr>
@@ -13744,9 +13741,9 @@
       </w:tcPr>
     </w:tblStylePr>
   </w:style>
-  <w:style w:type="table" w:styleId="Grillemoyenne3-Accent2">
+  <w:style w:type="table" w:styleId="MediumGrid3-Accent2">
     <w:name w:val="Medium Grid 3 Accent 2"/>
-    <w:basedOn w:val="TableauNormal"/>
+    <w:basedOn w:val="TableNormal"/>
     <w:uiPriority w:val="69"/>
     <w:rsid w:val="00CB0664"/>
     <w:pPr>
@@ -13878,9 +13875,9 @@
       </w:tcPr>
     </w:tblStylePr>
   </w:style>
-  <w:style w:type="table" w:styleId="Grillemoyenne3-Accent3">
+  <w:style w:type="table" w:styleId="MediumGrid3-Accent3">
     <w:name w:val="Medium Grid 3 Accent 3"/>
-    <w:basedOn w:val="TableauNormal"/>
+    <w:basedOn w:val="TableNormal"/>
     <w:uiPriority w:val="69"/>
     <w:rsid w:val="00CB0664"/>
     <w:pPr>
@@ -14012,9 +14009,9 @@
       </w:tcPr>
     </w:tblStylePr>
   </w:style>
-  <w:style w:type="table" w:styleId="Grillemoyenne3-Accent4">
+  <w:style w:type="table" w:styleId="MediumGrid3-Accent4">
     <w:name w:val="Medium Grid 3 Accent 4"/>
-    <w:basedOn w:val="TableauNormal"/>
+    <w:basedOn w:val="TableNormal"/>
     <w:uiPriority w:val="69"/>
     <w:rsid w:val="00CB0664"/>
     <w:pPr>
@@ -14146,9 +14143,9 @@
       </w:tcPr>
     </w:tblStylePr>
   </w:style>
-  <w:style w:type="table" w:styleId="Grillemoyenne3-Accent5">
+  <w:style w:type="table" w:styleId="MediumGrid3-Accent5">
     <w:name w:val="Medium Grid 3 Accent 5"/>
-    <w:basedOn w:val="TableauNormal"/>
+    <w:basedOn w:val="TableNormal"/>
     <w:uiPriority w:val="69"/>
     <w:rsid w:val="00CB0664"/>
     <w:pPr>
@@ -14280,9 +14277,9 @@
       </w:tcPr>
     </w:tblStylePr>
   </w:style>
-  <w:style w:type="table" w:styleId="Grillemoyenne3-Accent6">
+  <w:style w:type="table" w:styleId="MediumGrid3-Accent6">
     <w:name w:val="Medium Grid 3 Accent 6"/>
-    <w:basedOn w:val="TableauNormal"/>
+    <w:basedOn w:val="TableNormal"/>
     <w:uiPriority w:val="69"/>
     <w:rsid w:val="00CB0664"/>
     <w:pPr>
@@ -14414,9 +14411,9 @@
       </w:tcPr>
     </w:tblStylePr>
   </w:style>
-  <w:style w:type="table" w:styleId="Listefonce">
+  <w:style w:type="table" w:styleId="DarkList">
     <w:name w:val="Dark List"/>
-    <w:basedOn w:val="TableauNormal"/>
+    <w:basedOn w:val="TableNormal"/>
     <w:uiPriority w:val="70"/>
     <w:rsid w:val="00CB0664"/>
     <w:pPr>
@@ -14521,9 +14518,9 @@
       </w:tcPr>
     </w:tblStylePr>
   </w:style>
-  <w:style w:type="table" w:styleId="Listefonce-Accent1">
+  <w:style w:type="table" w:styleId="DarkList-Accent1">
     <w:name w:val="Dark List Accent 1"/>
-    <w:basedOn w:val="TableauNormal"/>
+    <w:basedOn w:val="TableNormal"/>
     <w:uiPriority w:val="70"/>
     <w:rsid w:val="00CB0664"/>
     <w:pPr>
@@ -14628,9 +14625,9 @@
       </w:tcPr>
     </w:tblStylePr>
   </w:style>
-  <w:style w:type="table" w:styleId="Listefonce-Accent2">
+  <w:style w:type="table" w:styleId="DarkList-Accent2">
     <w:name w:val="Dark List Accent 2"/>
-    <w:basedOn w:val="TableauNormal"/>
+    <w:basedOn w:val="TableNormal"/>
     <w:uiPriority w:val="70"/>
     <w:rsid w:val="00CB0664"/>
     <w:pPr>
@@ -14735,9 +14732,9 @@
       </w:tcPr>
     </w:tblStylePr>
   </w:style>
-  <w:style w:type="table" w:styleId="Listefonce-Accent3">
+  <w:style w:type="table" w:styleId="DarkList-Accent3">
     <w:name w:val="Dark List Accent 3"/>
-    <w:basedOn w:val="TableauNormal"/>
+    <w:basedOn w:val="TableNormal"/>
     <w:uiPriority w:val="70"/>
     <w:rsid w:val="00CB0664"/>
     <w:pPr>
@@ -14842,9 +14839,9 @@
       </w:tcPr>
     </w:tblStylePr>
   </w:style>
-  <w:style w:type="table" w:styleId="Listefonce-Accent4">
+  <w:style w:type="table" w:styleId="DarkList-Accent4">
     <w:name w:val="Dark List Accent 4"/>
-    <w:basedOn w:val="TableauNormal"/>
+    <w:basedOn w:val="TableNormal"/>
     <w:uiPriority w:val="70"/>
     <w:rsid w:val="00CB0664"/>
     <w:pPr>
@@ -14949,9 +14946,9 @@
       </w:tcPr>
     </w:tblStylePr>
   </w:style>
-  <w:style w:type="table" w:styleId="Listefonce-Accent5">
+  <w:style w:type="table" w:styleId="DarkList-Accent5">
     <w:name w:val="Dark List Accent 5"/>
-    <w:basedOn w:val="TableauNormal"/>
+    <w:basedOn w:val="TableNormal"/>
     <w:uiPriority w:val="70"/>
     <w:rsid w:val="00CB0664"/>
     <w:pPr>
@@ -15056,9 +15053,9 @@
       </w:tcPr>
     </w:tblStylePr>
   </w:style>
-  <w:style w:type="table" w:styleId="Listefonce-Accent6">
+  <w:style w:type="table" w:styleId="DarkList-Accent6">
     <w:name w:val="Dark List Accent 6"/>
-    <w:basedOn w:val="TableauNormal"/>
+    <w:basedOn w:val="TableNormal"/>
     <w:uiPriority w:val="70"/>
     <w:rsid w:val="00CB0664"/>
     <w:pPr>
@@ -15163,9 +15160,9 @@
       </w:tcPr>
     </w:tblStylePr>
   </w:style>
-  <w:style w:type="table" w:styleId="Tramecouleur">
+  <w:style w:type="table" w:styleId="ColorfulShading">
     <w:name w:val="Colorful Shading"/>
-    <w:basedOn w:val="TableauNormal"/>
+    <w:basedOn w:val="TableNormal"/>
     <w:uiPriority w:val="71"/>
     <w:rsid w:val="00CB0664"/>
     <w:pPr>
@@ -15278,9 +15275,9 @@
       </w:rPr>
     </w:tblStylePr>
   </w:style>
-  <w:style w:type="table" w:styleId="Tramecouleur-Accent1">
+  <w:style w:type="table" w:styleId="ColorfulShading-Accent1">
     <w:name w:val="Colorful Shading Accent 1"/>
-    <w:basedOn w:val="TableauNormal"/>
+    <w:basedOn w:val="TableNormal"/>
     <w:uiPriority w:val="71"/>
     <w:rsid w:val="00CB0664"/>
     <w:pPr>
@@ -15393,9 +15390,9 @@
       </w:rPr>
     </w:tblStylePr>
   </w:style>
-  <w:style w:type="table" w:styleId="Tramecouleur-Accent2">
+  <w:style w:type="table" w:styleId="ColorfulShading-Accent2">
     <w:name w:val="Colorful Shading Accent 2"/>
-    <w:basedOn w:val="TableauNormal"/>
+    <w:basedOn w:val="TableNormal"/>
     <w:uiPriority w:val="71"/>
     <w:rsid w:val="00CB0664"/>
     <w:pPr>
@@ -15508,9 +15505,9 @@
       </w:rPr>
     </w:tblStylePr>
   </w:style>
-  <w:style w:type="table" w:styleId="Tramecouleur-Accent3">
+  <w:style w:type="table" w:styleId="ColorfulShading-Accent3">
     <w:name w:val="Colorful Shading Accent 3"/>
-    <w:basedOn w:val="TableauNormal"/>
+    <w:basedOn w:val="TableNormal"/>
     <w:uiPriority w:val="71"/>
     <w:rsid w:val="00CB0664"/>
     <w:pPr>
@@ -15613,9 +15610,9 @@
       </w:tcPr>
     </w:tblStylePr>
   </w:style>
-  <w:style w:type="table" w:styleId="Tramecouleur-Accent4">
+  <w:style w:type="table" w:styleId="ColorfulShading-Accent4">
     <w:name w:val="Colorful Shading Accent 4"/>
-    <w:basedOn w:val="TableauNormal"/>
+    <w:basedOn w:val="TableNormal"/>
     <w:uiPriority w:val="71"/>
     <w:rsid w:val="00CB0664"/>
     <w:pPr>
@@ -15728,9 +15725,9 @@
       </w:rPr>
     </w:tblStylePr>
   </w:style>
-  <w:style w:type="table" w:styleId="Tramecouleur-Accent5">
+  <w:style w:type="table" w:styleId="ColorfulShading-Accent5">
     <w:name w:val="Colorful Shading Accent 5"/>
-    <w:basedOn w:val="TableauNormal"/>
+    <w:basedOn w:val="TableNormal"/>
     <w:uiPriority w:val="71"/>
     <w:rsid w:val="00CB0664"/>
     <w:pPr>
@@ -15843,9 +15840,9 @@
       </w:rPr>
     </w:tblStylePr>
   </w:style>
-  <w:style w:type="table" w:styleId="Tramecouleur-Accent6">
+  <w:style w:type="table" w:styleId="ColorfulShading-Accent6">
     <w:name w:val="Colorful Shading Accent 6"/>
-    <w:basedOn w:val="TableauNormal"/>
+    <w:basedOn w:val="TableNormal"/>
     <w:uiPriority w:val="71"/>
     <w:rsid w:val="00CB0664"/>
     <w:pPr>
@@ -15958,9 +15955,9 @@
       </w:rPr>
     </w:tblStylePr>
   </w:style>
-  <w:style w:type="table" w:styleId="Listecouleur">
+  <w:style w:type="table" w:styleId="ColorfulList">
     <w:name w:val="Colorful List"/>
-    <w:basedOn w:val="TableauNormal"/>
+    <w:basedOn w:val="TableNormal"/>
     <w:uiPriority w:val="72"/>
     <w:rsid w:val="00CB0664"/>
     <w:pPr>
@@ -16037,9 +16034,9 @@
       </w:tcPr>
     </w:tblStylePr>
   </w:style>
-  <w:style w:type="table" w:styleId="Listecouleur-Accent1">
+  <w:style w:type="table" w:styleId="ColorfulList-Accent1">
     <w:name w:val="Colorful List Accent 1"/>
-    <w:basedOn w:val="TableauNormal"/>
+    <w:basedOn w:val="TableNormal"/>
     <w:uiPriority w:val="72"/>
     <w:rsid w:val="00CB0664"/>
     <w:pPr>
@@ -16116,9 +16113,9 @@
       </w:tcPr>
     </w:tblStylePr>
   </w:style>
-  <w:style w:type="table" w:styleId="Listecouleur-Accent2">
+  <w:style w:type="table" w:styleId="ColorfulList-Accent2">
     <w:name w:val="Colorful List Accent 2"/>
-    <w:basedOn w:val="TableauNormal"/>
+    <w:basedOn w:val="TableNormal"/>
     <w:uiPriority w:val="72"/>
     <w:rsid w:val="00CB0664"/>
     <w:pPr>
@@ -16195,9 +16192,9 @@
       </w:tcPr>
     </w:tblStylePr>
   </w:style>
-  <w:style w:type="table" w:styleId="Listecouleur-Accent3">
+  <w:style w:type="table" w:styleId="ColorfulList-Accent3">
     <w:name w:val="Colorful List Accent 3"/>
-    <w:basedOn w:val="TableauNormal"/>
+    <w:basedOn w:val="TableNormal"/>
     <w:uiPriority w:val="72"/>
     <w:rsid w:val="00CB0664"/>
     <w:pPr>
@@ -16274,9 +16271,9 @@
       </w:tcPr>
     </w:tblStylePr>
   </w:style>
-  <w:style w:type="table" w:styleId="Listecouleur-Accent4">
+  <w:style w:type="table" w:styleId="ColorfulList-Accent4">
     <w:name w:val="Colorful List Accent 4"/>
-    <w:basedOn w:val="TableauNormal"/>
+    <w:basedOn w:val="TableNormal"/>
     <w:uiPriority w:val="72"/>
     <w:rsid w:val="00CB0664"/>
     <w:pPr>
@@ -16353,9 +16350,9 @@
       </w:tcPr>
     </w:tblStylePr>
   </w:style>
-  <w:style w:type="table" w:styleId="Listecouleur-Accent5">
+  <w:style w:type="table" w:styleId="ColorfulList-Accent5">
     <w:name w:val="Colorful List Accent 5"/>
-    <w:basedOn w:val="TableauNormal"/>
+    <w:basedOn w:val="TableNormal"/>
     <w:uiPriority w:val="72"/>
     <w:rsid w:val="00CB0664"/>
     <w:pPr>
@@ -16432,9 +16429,9 @@
       </w:tcPr>
     </w:tblStylePr>
   </w:style>
-  <w:style w:type="table" w:styleId="Listecouleur-Accent6">
+  <w:style w:type="table" w:styleId="ColorfulList-Accent6">
     <w:name w:val="Colorful List Accent 6"/>
-    <w:basedOn w:val="TableauNormal"/>
+    <w:basedOn w:val="TableNormal"/>
     <w:uiPriority w:val="72"/>
     <w:rsid w:val="00CB0664"/>
     <w:pPr>
@@ -16511,9 +16508,9 @@
       </w:tcPr>
     </w:tblStylePr>
   </w:style>
-  <w:style w:type="table" w:styleId="Grillecouleur">
+  <w:style w:type="table" w:styleId="ColorfulGrid">
     <w:name w:val="Colorful Grid"/>
-    <w:basedOn w:val="TableauNormal"/>
+    <w:basedOn w:val="TableNormal"/>
     <w:uiPriority w:val="73"/>
     <w:rsid w:val="00CB0664"/>
     <w:pPr>
@@ -16584,9 +16581,9 @@
       </w:tcPr>
     </w:tblStylePr>
   </w:style>
-  <w:style w:type="table" w:styleId="Grillecouleur-Accent1">
+  <w:style w:type="table" w:styleId="ColorfulGrid-Accent1">
     <w:name w:val="Colorful Grid Accent 1"/>
-    <w:basedOn w:val="TableauNormal"/>
+    <w:basedOn w:val="TableNormal"/>
     <w:uiPriority w:val="73"/>
     <w:rsid w:val="00CB0664"/>
     <w:pPr>
@@ -16657,9 +16654,9 @@
       </w:tcPr>
     </w:tblStylePr>
   </w:style>
-  <w:style w:type="table" w:styleId="Grillecouleur-Accent2">
+  <w:style w:type="table" w:styleId="ColorfulGrid-Accent2">
     <w:name w:val="Colorful Grid Accent 2"/>
-    <w:basedOn w:val="TableauNormal"/>
+    <w:basedOn w:val="TableNormal"/>
     <w:uiPriority w:val="73"/>
     <w:rsid w:val="00CB0664"/>
     <w:pPr>
@@ -16730,9 +16727,9 @@
       </w:tcPr>
     </w:tblStylePr>
   </w:style>
-  <w:style w:type="table" w:styleId="Grillecouleur-Accent3">
+  <w:style w:type="table" w:styleId="ColorfulGrid-Accent3">
     <w:name w:val="Colorful Grid Accent 3"/>
-    <w:basedOn w:val="TableauNormal"/>
+    <w:basedOn w:val="TableNormal"/>
     <w:uiPriority w:val="73"/>
     <w:rsid w:val="00CB0664"/>
     <w:pPr>
@@ -16803,9 +16800,9 @@
       </w:tcPr>
     </w:tblStylePr>
   </w:style>
-  <w:style w:type="table" w:styleId="Grillecouleur-Accent4">
+  <w:style w:type="table" w:styleId="ColorfulGrid-Accent4">
     <w:name w:val="Colorful Grid Accent 4"/>
-    <w:basedOn w:val="TableauNormal"/>
+    <w:basedOn w:val="TableNormal"/>
     <w:uiPriority w:val="73"/>
     <w:rsid w:val="00CB0664"/>
     <w:pPr>
@@ -16876,9 +16873,9 @@
       </w:tcPr>
     </w:tblStylePr>
   </w:style>
-  <w:style w:type="table" w:styleId="Grillecouleur-Accent5">
+  <w:style w:type="table" w:styleId="ColorfulGrid-Accent5">
     <w:name w:val="Colorful Grid Accent 5"/>
-    <w:basedOn w:val="TableauNormal"/>
+    <w:basedOn w:val="TableNormal"/>
     <w:uiPriority w:val="73"/>
     <w:rsid w:val="00CB0664"/>
     <w:pPr>
@@ -16949,9 +16946,9 @@
       </w:tcPr>
     </w:tblStylePr>
   </w:style>
-  <w:style w:type="table" w:styleId="Grillecouleur-Accent6">
+  <w:style w:type="table" w:styleId="ColorfulGrid-Accent6">
     <w:name w:val="Colorful Grid Accent 6"/>
-    <w:basedOn w:val="TableauNormal"/>
+    <w:basedOn w:val="TableNormal"/>
     <w:uiPriority w:val="73"/>
     <w:rsid w:val="00CB0664"/>
     <w:pPr>
@@ -17350,7 +17347,7 @@
 </file>
 
 <file path=customXml/itemProps1.xml><?xml version="1.0" encoding="utf-8"?>
-<ds:datastoreItem xmlns:ds="http://schemas.openxmlformats.org/officeDocument/2006/customXml" ds:itemID="{EF278816-EC6F-A645-907D-7F25AECB1D4A}">
+<ds:datastoreItem xmlns:ds="http://schemas.openxmlformats.org/officeDocument/2006/customXml" ds:itemID="{686C8059-1090-4E7A-9A88-6F6C90664FC5}">
   <ds:schemaRefs>
     <ds:schemaRef ds:uri="http://schemas.openxmlformats.org/officeDocument/2006/bibliography"/>
   </ds:schemaRefs>

</xml_diff>